<commit_message>
Ajustements des valeurs de la Table de Décision pour avoir une correspondance avec nos CA précédents et leurs contextes
</commit_message>
<xml_diff>
--- a/docs/rendus/Séance 2.docx
+++ b/docs/rendus/Séance 2.docx
@@ -4519,7 +4519,13 @@
           </w:tcPr>
           <w:p>
             <w:r>
-              <w:t>5,8,8</w:t>
+              <w:t>5,</w:t>
+            </w:r>
+            <w:r>
+              <w:t>5</w:t>
+            </w:r>
+            <w:r>
+              <w:t>,8</w:t>
             </w:r>
           </w:p>
         </w:tc>
@@ -4662,11 +4668,9 @@
             <w:tcW w:w="1874" w:type="dxa"/>
           </w:tcPr>
           <w:p>
-            <w:proofErr w:type="spellStart"/>
             <w:r>
               <w:t>Café,Café,Café</w:t>
             </w:r>
-            <w:proofErr w:type="spellEnd"/>
           </w:p>
         </w:tc>
         <w:tc>
@@ -4727,7 +4731,10 @@
           </w:tcPr>
           <w:p>
             <w:r>
-              <w:t xml:space="preserve">3 </w:t>
+              <w:t>2</w:t>
+            </w:r>
+            <w:r>
+              <w:t xml:space="preserve"> </w:t>
             </w:r>
           </w:p>
         </w:tc>
@@ -4737,7 +4744,16 @@
           </w:tcPr>
           <w:p>
             <w:r>
-              <w:t>3,8,20</w:t>
+              <w:t>3,</w:t>
+            </w:r>
+            <w:r>
+              <w:t>5</w:t>
+            </w:r>
+            <w:r>
+              <w:t>,</w:t>
+            </w:r>
+            <w:r>
+              <w:t>8</w:t>
             </w:r>
           </w:p>
         </w:tc>
@@ -4757,7 +4773,7 @@
           </w:tcPr>
           <w:p>
             <w:r>
-              <w:t>8</w:t>
+              <w:t>5</w:t>
             </w:r>
           </w:p>
         </w:tc>
@@ -5069,39 +5085,7 @@
     </w:p>
     <w:p>
       <w:r>
-        <w:t xml:space="preserve">Il faut ajouter une classe qui manipule le </w:t>
-      </w:r>
-      <w:proofErr w:type="spellStart"/>
-      <w:r>
-        <w:t>GameSession</w:t>
-      </w:r>
-      <w:proofErr w:type="spellEnd"/>
-      <w:r>
-        <w:t xml:space="preserve"> ou un attribut de cette dernière nommé </w:t>
-      </w:r>
-      <w:proofErr w:type="spellStart"/>
-      <w:r>
-        <w:t>RuleEngine</w:t>
-      </w:r>
-      <w:proofErr w:type="spellEnd"/>
-      <w:r>
-        <w:t xml:space="preserve"> (du </w:t>
-      </w:r>
-      <w:proofErr w:type="spellStart"/>
-      <w:r>
-        <w:t>domain</w:t>
-      </w:r>
-      <w:proofErr w:type="spellEnd"/>
-      <w:r>
-        <w:t xml:space="preserve">) qui servira a renvoyer la valeur et le résultat du vote en fonction de la </w:t>
-      </w:r>
-      <w:proofErr w:type="spellStart"/>
-      <w:r>
-        <w:t>game</w:t>
-      </w:r>
-      <w:proofErr w:type="spellEnd"/>
-      <w:r>
-        <w:t xml:space="preserve"> session. A voir ou placer cette classe niveau architecture dans le projet. Les test devront utiliser cette classe à la fin. </w:t>
+        <w:t xml:space="preserve">Il faut ajouter une classe qui manipule le GameSession ou un attribut de cette dernière nommé RuleEngine (du domain) qui servira a renvoyer la valeur et le résultat du vote en fonction de la game session. A voir ou placer cette classe niveau architecture dans le projet. Les test devront utiliser cette classe à la fin. </w:t>
       </w:r>
     </w:p>
     <w:sectPr>
@@ -9026,7 +9010,7 @@
           </w:pPr>
           <w:r>
             <w:rPr>
-              <w:color w:val="0F4761" w:themeColor="accent1" w:themeShade="BF"/>
+              <w:color w:val="2F5496" w:themeColor="accent1" w:themeShade="BF"/>
             </w:rPr>
             <w:t>[Nom de la société]</w:t>
           </w:r>
@@ -9056,7 +9040,7 @@
           <w:r>
             <w:rPr>
               <w:rFonts w:asciiTheme="majorHAnsi" w:eastAsiaTheme="majorEastAsia" w:hAnsiTheme="majorHAnsi" w:cstheme="majorBidi"/>
-              <w:color w:val="156082" w:themeColor="accent1"/>
+              <w:color w:val="4472C4" w:themeColor="accent1"/>
               <w:sz w:val="88"/>
               <w:szCs w:val="88"/>
             </w:rPr>
@@ -9087,7 +9071,7 @@
           </w:pPr>
           <w:r>
             <w:rPr>
-              <w:color w:val="0F4761" w:themeColor="accent1" w:themeShade="BF"/>
+              <w:color w:val="2F5496" w:themeColor="accent1" w:themeShade="BF"/>
             </w:rPr>
             <w:t>[Sous-titre du document]</w:t>
           </w:r>
@@ -9116,7 +9100,7 @@
           </w:pPr>
           <w:r>
             <w:rPr>
-              <w:color w:val="156082" w:themeColor="accent1"/>
+              <w:color w:val="4472C4" w:themeColor="accent1"/>
               <w:sz w:val="28"/>
               <w:szCs w:val="28"/>
             </w:rPr>
@@ -9147,7 +9131,7 @@
           </w:pPr>
           <w:r>
             <w:rPr>
-              <w:color w:val="156082" w:themeColor="accent1"/>
+              <w:color w:val="4472C4" w:themeColor="accent1"/>
               <w:sz w:val="28"/>
               <w:szCs w:val="28"/>
             </w:rPr>
@@ -9198,7 +9182,7 @@
   </w:font>
   <w:font w:name="Sofia Pro">
     <w:altName w:val="Calibri"/>
-    <w:panose1 w:val="02000000000000000000"/>
+    <w:panose1 w:val="00000000000000000000"/>
     <w:charset w:val="00"/>
     <w:family w:val="swiss"/>
     <w:notTrueType/>
@@ -9207,7 +9191,6 @@
   </w:font>
   <w:font w:name="TT Neoris Trial">
     <w:altName w:val="Calibri"/>
-    <w:panose1 w:val="020B0003030000020004"/>
     <w:charset w:val="00"/>
     <w:family w:val="swiss"/>
     <w:pitch w:val="variable"/>
@@ -9221,7 +9204,6 @@
   </w:font>
   <w:font w:name="OCR-A BT">
     <w:altName w:val="Calibri"/>
-    <w:panose1 w:val="020F0501020204020304"/>
     <w:charset w:val="00"/>
     <w:family w:val="swiss"/>
     <w:pitch w:val="variable"/>
@@ -9240,6 +9222,13 @@
     <w:family w:val="modern"/>
     <w:pitch w:val="fixed"/>
     <w:sig w:usb0="8000028F" w:usb1="00001800" w:usb2="00000000" w:usb3="00000000" w:csb0="0000001F" w:csb1="00000000"/>
+  </w:font>
+  <w:font w:name="Calibri Light">
+    <w:panose1 w:val="020F0302020204030204"/>
+    <w:charset w:val="00"/>
+    <w:family w:val="swiss"/>
+    <w:pitch w:val="variable"/>
+    <w:sig w:usb0="E4002EFF" w:usb1="C200247B" w:usb2="00000009" w:usb3="00000000" w:csb0="000001FF" w:csb1="00000000"/>
   </w:font>
 </w:fonts>
 </file>
@@ -9273,6 +9262,7 @@
     <w:rsid w:val="004F31F8"/>
     <w:rsid w:val="005259C0"/>
     <w:rsid w:val="005D2BF4"/>
+    <w:rsid w:val="005F42EC"/>
     <w:rsid w:val="006666FB"/>
     <w:rsid w:val="006E64CE"/>
     <w:rsid w:val="00785775"/>
@@ -9280,6 +9270,7 @@
     <w:rsid w:val="008B2538"/>
     <w:rsid w:val="009449BA"/>
     <w:rsid w:val="00A027E6"/>
+    <w:rsid w:val="00AE0233"/>
     <w:rsid w:val="00B021F1"/>
     <w:rsid w:val="00E4678A"/>
     <w:rsid w:val="00E71964"/>

</xml_diff>

<commit_message>
doc(R2) : Fin du rendu scéance 2 et export PDF
</commit_message>
<xml_diff>
--- a/docs/rendus/Séance 2.docx
+++ b/docs/rendus/Séance 2.docx
@@ -448,7 +448,7 @@
           <w:r>
             <w:fldChar w:fldCharType="separate"/>
           </w:r>
-          <w:hyperlink w:anchor="_Toc242695048" w:history="1">
+          <w:hyperlink w:anchor="_Toc242870898" w:history="1">
             <w:r>
               <w:rPr>
                 <w:rStyle w:val="Lienhypertexte"/>
@@ -471,7 +471,7 @@
                 <w:rStyle w:val="Lienhypertexte"/>
                 <w:noProof/>
               </w:rPr>
-              <w:t>Critère d’acceptation</w:t>
+              <w:t>Table de décision</w:t>
             </w:r>
             <w:r>
               <w:rPr>
@@ -492,7 +492,97 @@
                 <w:noProof/>
                 <w:webHidden/>
               </w:rPr>
-              <w:instrText xml:space="preserve"> PAGEREF _Toc242695048 \h </w:instrText>
+              <w:instrText xml:space="preserve"> PAGEREF _Toc242870898 \h </w:instrText>
+            </w:r>
+            <w:r>
+              <w:rPr>
+                <w:noProof/>
+                <w:webHidden/>
+              </w:rPr>
+            </w:r>
+            <w:r>
+              <w:rPr>
+                <w:noProof/>
+                <w:webHidden/>
+              </w:rPr>
+              <w:fldChar w:fldCharType="separate"/>
+            </w:r>
+            <w:r>
+              <w:rPr>
+                <w:noProof/>
+                <w:webHidden/>
+              </w:rPr>
+              <w:t>2</w:t>
+            </w:r>
+            <w:r>
+              <w:rPr>
+                <w:noProof/>
+                <w:webHidden/>
+              </w:rPr>
+              <w:fldChar w:fldCharType="end"/>
+            </w:r>
+          </w:hyperlink>
+        </w:p>
+        <w:p>
+          <w:pPr>
+            <w:pStyle w:val="TM1"/>
+            <w:tabs>
+              <w:tab w:val="left" w:pos="480"/>
+              <w:tab w:val="right" w:leader="dot" w:pos="9062"/>
+            </w:tabs>
+            <w:rPr>
+              <w:rFonts w:asciiTheme="minorHAnsi" w:eastAsiaTheme="minorEastAsia" w:hAnsiTheme="minorHAnsi"/>
+              <w:noProof/>
+              <w:spacing w:val="0"/>
+              <w:sz w:val="24"/>
+              <w:lang w:eastAsia="fr-FR"/>
+            </w:rPr>
+          </w:pPr>
+          <w:hyperlink w:anchor="_Toc242870899" w:history="1">
+            <w:r>
+              <w:rPr>
+                <w:rStyle w:val="Lienhypertexte"/>
+                <w:noProof/>
+              </w:rPr>
+              <w:t>II.</w:t>
+            </w:r>
+            <w:r>
+              <w:rPr>
+                <w:rFonts w:asciiTheme="minorHAnsi" w:eastAsiaTheme="minorEastAsia" w:hAnsiTheme="minorHAnsi"/>
+                <w:noProof/>
+                <w:spacing w:val="0"/>
+                <w:sz w:val="24"/>
+                <w:lang w:eastAsia="fr-FR"/>
+              </w:rPr>
+              <w:tab/>
+            </w:r>
+            <w:r>
+              <w:rPr>
+                <w:rStyle w:val="Lienhypertexte"/>
+                <w:noProof/>
+              </w:rPr>
+              <w:t>Liste des commits</w:t>
+            </w:r>
+            <w:r>
+              <w:rPr>
+                <w:noProof/>
+                <w:webHidden/>
+              </w:rPr>
+              <w:tab/>
+            </w:r>
+            <w:r>
+              <w:rPr>
+                <w:noProof/>
+                <w:webHidden/>
+              </w:rPr>
+              <w:fldChar w:fldCharType="begin"/>
+            </w:r>
+            <w:r>
+              <w:rPr>
+                <w:noProof/>
+                <w:webHidden/>
+              </w:rPr>
+              <w:instrText xml:space="preserve"> PAGEREF _Toc242870899 \h </w:instrText>
             </w:r>
             <w:r>
               <w:rPr>
@@ -538,13 +628,13 @@
               <w:lang w:eastAsia="fr-FR"/>
             </w:rPr>
           </w:pPr>
-          <w:hyperlink w:anchor="_Toc242695049" w:history="1">
+          <w:hyperlink w:anchor="_Toc242870900" w:history="1">
             <w:r>
               <w:rPr>
                 <w:rStyle w:val="Lienhypertexte"/>
                 <w:noProof/>
               </w:rPr>
-              <w:t>I. 1.</w:t>
+              <w:t>II. 1.</w:t>
             </w:r>
             <w:r>
               <w:rPr>
@@ -561,7 +651,7 @@
                 <w:rStyle w:val="Lienhypertexte"/>
                 <w:noProof/>
               </w:rPr>
-              <w:t>US-01</w:t>
+              <w:t>Rouge</w:t>
             </w:r>
             <w:r>
               <w:rPr>
@@ -582,187 +672,7 @@
                 <w:noProof/>
                 <w:webHidden/>
               </w:rPr>
-              <w:instrText xml:space="preserve"> PAGEREF _Toc242695049 \h </w:instrText>
-            </w:r>
-            <w:r>
-              <w:rPr>
-                <w:noProof/>
-                <w:webHidden/>
-              </w:rPr>
-            </w:r>
-            <w:r>
-              <w:rPr>
-                <w:noProof/>
-                <w:webHidden/>
-              </w:rPr>
-              <w:fldChar w:fldCharType="separate"/>
-            </w:r>
-            <w:r>
-              <w:rPr>
-                <w:noProof/>
-                <w:webHidden/>
-              </w:rPr>
-              <w:t>3</w:t>
-            </w:r>
-            <w:r>
-              <w:rPr>
-                <w:noProof/>
-                <w:webHidden/>
-              </w:rPr>
-              <w:fldChar w:fldCharType="end"/>
-            </w:r>
-          </w:hyperlink>
-        </w:p>
-        <w:p>
-          <w:pPr>
-            <w:pStyle w:val="TM3"/>
-            <w:tabs>
-              <w:tab w:val="left" w:pos="960"/>
-              <w:tab w:val="right" w:leader="dot" w:pos="9062"/>
-            </w:tabs>
-            <w:rPr>
-              <w:rFonts w:asciiTheme="minorHAnsi" w:eastAsiaTheme="minorEastAsia" w:hAnsiTheme="minorHAnsi"/>
-              <w:noProof/>
-              <w:spacing w:val="0"/>
-              <w:sz w:val="24"/>
-              <w:lang w:eastAsia="fr-FR"/>
-            </w:rPr>
-          </w:pPr>
-          <w:hyperlink w:anchor="_Toc242695050" w:history="1">
-            <w:r>
-              <w:rPr>
-                <w:rStyle w:val="Lienhypertexte"/>
-                <w:noProof/>
-              </w:rPr>
-              <w:t>a.</w:t>
-            </w:r>
-            <w:r>
-              <w:rPr>
-                <w:rFonts w:asciiTheme="minorHAnsi" w:eastAsiaTheme="minorEastAsia" w:hAnsiTheme="minorHAnsi"/>
-                <w:noProof/>
-                <w:spacing w:val="0"/>
-                <w:sz w:val="24"/>
-                <w:lang w:eastAsia="fr-FR"/>
-              </w:rPr>
-              <w:tab/>
-            </w:r>
-            <w:r>
-              <w:rPr>
-                <w:rStyle w:val="Lienhypertexte"/>
-                <w:noProof/>
-              </w:rPr>
-              <w:t>CA-01.1</w:t>
-            </w:r>
-            <w:r>
-              <w:rPr>
-                <w:noProof/>
-                <w:webHidden/>
-              </w:rPr>
-              <w:tab/>
-            </w:r>
-            <w:r>
-              <w:rPr>
-                <w:noProof/>
-                <w:webHidden/>
-              </w:rPr>
-              <w:fldChar w:fldCharType="begin"/>
-            </w:r>
-            <w:r>
-              <w:rPr>
-                <w:noProof/>
-                <w:webHidden/>
-              </w:rPr>
-              <w:instrText xml:space="preserve"> PAGEREF _Toc242695050 \h </w:instrText>
-            </w:r>
-            <w:r>
-              <w:rPr>
-                <w:noProof/>
-                <w:webHidden/>
-              </w:rPr>
-            </w:r>
-            <w:r>
-              <w:rPr>
-                <w:noProof/>
-                <w:webHidden/>
-              </w:rPr>
-              <w:fldChar w:fldCharType="separate"/>
-            </w:r>
-            <w:r>
-              <w:rPr>
-                <w:noProof/>
-                <w:webHidden/>
-              </w:rPr>
-              <w:t>3</w:t>
-            </w:r>
-            <w:r>
-              <w:rPr>
-                <w:noProof/>
-                <w:webHidden/>
-              </w:rPr>
-              <w:fldChar w:fldCharType="end"/>
-            </w:r>
-          </w:hyperlink>
-        </w:p>
-        <w:p>
-          <w:pPr>
-            <w:pStyle w:val="TM3"/>
-            <w:tabs>
-              <w:tab w:val="left" w:pos="960"/>
-              <w:tab w:val="right" w:leader="dot" w:pos="9062"/>
-            </w:tabs>
-            <w:rPr>
-              <w:rFonts w:asciiTheme="minorHAnsi" w:eastAsiaTheme="minorEastAsia" w:hAnsiTheme="minorHAnsi"/>
-              <w:noProof/>
-              <w:spacing w:val="0"/>
-              <w:sz w:val="24"/>
-              <w:lang w:eastAsia="fr-FR"/>
-            </w:rPr>
-          </w:pPr>
-          <w:hyperlink w:anchor="_Toc242695051" w:history="1">
-            <w:r>
-              <w:rPr>
-                <w:rStyle w:val="Lienhypertexte"/>
-                <w:noProof/>
-              </w:rPr>
-              <w:t>b.</w:t>
-            </w:r>
-            <w:r>
-              <w:rPr>
-                <w:rFonts w:asciiTheme="minorHAnsi" w:eastAsiaTheme="minorEastAsia" w:hAnsiTheme="minorHAnsi"/>
-                <w:noProof/>
-                <w:spacing w:val="0"/>
-                <w:sz w:val="24"/>
-                <w:lang w:eastAsia="fr-FR"/>
-              </w:rPr>
-              <w:tab/>
-            </w:r>
-            <w:r>
-              <w:rPr>
-                <w:rStyle w:val="Lienhypertexte"/>
-                <w:noProof/>
-              </w:rPr>
-              <w:t>CA-01.2</w:t>
-            </w:r>
-            <w:r>
-              <w:rPr>
-                <w:noProof/>
-                <w:webHidden/>
-              </w:rPr>
-              <w:tab/>
-            </w:r>
-            <w:r>
-              <w:rPr>
-                <w:noProof/>
-                <w:webHidden/>
-              </w:rPr>
-              <w:fldChar w:fldCharType="begin"/>
-            </w:r>
-            <w:r>
-              <w:rPr>
-                <w:noProof/>
-                <w:webHidden/>
-              </w:rPr>
-              <w:instrText xml:space="preserve"> PAGEREF _Toc242695051 \h </w:instrText>
+              <w:instrText xml:space="preserve"> PAGEREF _Toc242870900 \h </w:instrText>
             </w:r>
             <w:r>
               <w:rPr>
@@ -808,13 +718,13 @@
               <w:lang w:eastAsia="fr-FR"/>
             </w:rPr>
           </w:pPr>
-          <w:hyperlink w:anchor="_Toc242695052" w:history="1">
+          <w:hyperlink w:anchor="_Toc242870901" w:history="1">
             <w:r>
               <w:rPr>
                 <w:rStyle w:val="Lienhypertexte"/>
                 <w:noProof/>
               </w:rPr>
-              <w:t>I. 2.</w:t>
+              <w:t>II. 2.</w:t>
             </w:r>
             <w:r>
               <w:rPr>
@@ -831,7 +741,7 @@
                 <w:rStyle w:val="Lienhypertexte"/>
                 <w:noProof/>
               </w:rPr>
-              <w:t>US-02</w:t>
+              <w:t>Vert</w:t>
             </w:r>
             <w:r>
               <w:rPr>
@@ -852,187 +762,7 @@
                 <w:noProof/>
                 <w:webHidden/>
               </w:rPr>
-              <w:instrText xml:space="preserve"> PAGEREF _Toc242695052 \h </w:instrText>
-            </w:r>
-            <w:r>
-              <w:rPr>
-                <w:noProof/>
-                <w:webHidden/>
-              </w:rPr>
-            </w:r>
-            <w:r>
-              <w:rPr>
-                <w:noProof/>
-                <w:webHidden/>
-              </w:rPr>
-              <w:fldChar w:fldCharType="separate"/>
-            </w:r>
-            <w:r>
-              <w:rPr>
-                <w:noProof/>
-                <w:webHidden/>
-              </w:rPr>
-              <w:t>3</w:t>
-            </w:r>
-            <w:r>
-              <w:rPr>
-                <w:noProof/>
-                <w:webHidden/>
-              </w:rPr>
-              <w:fldChar w:fldCharType="end"/>
-            </w:r>
-          </w:hyperlink>
-        </w:p>
-        <w:p>
-          <w:pPr>
-            <w:pStyle w:val="TM3"/>
-            <w:tabs>
-              <w:tab w:val="left" w:pos="960"/>
-              <w:tab w:val="right" w:leader="dot" w:pos="9062"/>
-            </w:tabs>
-            <w:rPr>
-              <w:rFonts w:asciiTheme="minorHAnsi" w:eastAsiaTheme="minorEastAsia" w:hAnsiTheme="minorHAnsi"/>
-              <w:noProof/>
-              <w:spacing w:val="0"/>
-              <w:sz w:val="24"/>
-              <w:lang w:eastAsia="fr-FR"/>
-            </w:rPr>
-          </w:pPr>
-          <w:hyperlink w:anchor="_Toc242695053" w:history="1">
-            <w:r>
-              <w:rPr>
-                <w:rStyle w:val="Lienhypertexte"/>
-                <w:noProof/>
-              </w:rPr>
-              <w:t>a.</w:t>
-            </w:r>
-            <w:r>
-              <w:rPr>
-                <w:rFonts w:asciiTheme="minorHAnsi" w:eastAsiaTheme="minorEastAsia" w:hAnsiTheme="minorHAnsi"/>
-                <w:noProof/>
-                <w:spacing w:val="0"/>
-                <w:sz w:val="24"/>
-                <w:lang w:eastAsia="fr-FR"/>
-              </w:rPr>
-              <w:tab/>
-            </w:r>
-            <w:r>
-              <w:rPr>
-                <w:rStyle w:val="Lienhypertexte"/>
-                <w:noProof/>
-              </w:rPr>
-              <w:t>CA-02.1</w:t>
-            </w:r>
-            <w:r>
-              <w:rPr>
-                <w:noProof/>
-                <w:webHidden/>
-              </w:rPr>
-              <w:tab/>
-            </w:r>
-            <w:r>
-              <w:rPr>
-                <w:noProof/>
-                <w:webHidden/>
-              </w:rPr>
-              <w:fldChar w:fldCharType="begin"/>
-            </w:r>
-            <w:r>
-              <w:rPr>
-                <w:noProof/>
-                <w:webHidden/>
-              </w:rPr>
-              <w:instrText xml:space="preserve"> PAGEREF _Toc242695053 \h </w:instrText>
-            </w:r>
-            <w:r>
-              <w:rPr>
-                <w:noProof/>
-                <w:webHidden/>
-              </w:rPr>
-            </w:r>
-            <w:r>
-              <w:rPr>
-                <w:noProof/>
-                <w:webHidden/>
-              </w:rPr>
-              <w:fldChar w:fldCharType="separate"/>
-            </w:r>
-            <w:r>
-              <w:rPr>
-                <w:noProof/>
-                <w:webHidden/>
-              </w:rPr>
-              <w:t>3</w:t>
-            </w:r>
-            <w:r>
-              <w:rPr>
-                <w:noProof/>
-                <w:webHidden/>
-              </w:rPr>
-              <w:fldChar w:fldCharType="end"/>
-            </w:r>
-          </w:hyperlink>
-        </w:p>
-        <w:p>
-          <w:pPr>
-            <w:pStyle w:val="TM3"/>
-            <w:tabs>
-              <w:tab w:val="left" w:pos="960"/>
-              <w:tab w:val="right" w:leader="dot" w:pos="9062"/>
-            </w:tabs>
-            <w:rPr>
-              <w:rFonts w:asciiTheme="minorHAnsi" w:eastAsiaTheme="minorEastAsia" w:hAnsiTheme="minorHAnsi"/>
-              <w:noProof/>
-              <w:spacing w:val="0"/>
-              <w:sz w:val="24"/>
-              <w:lang w:eastAsia="fr-FR"/>
-            </w:rPr>
-          </w:pPr>
-          <w:hyperlink w:anchor="_Toc242695054" w:history="1">
-            <w:r>
-              <w:rPr>
-                <w:rStyle w:val="Lienhypertexte"/>
-                <w:noProof/>
-              </w:rPr>
-              <w:t>b.</w:t>
-            </w:r>
-            <w:r>
-              <w:rPr>
-                <w:rFonts w:asciiTheme="minorHAnsi" w:eastAsiaTheme="minorEastAsia" w:hAnsiTheme="minorHAnsi"/>
-                <w:noProof/>
-                <w:spacing w:val="0"/>
-                <w:sz w:val="24"/>
-                <w:lang w:eastAsia="fr-FR"/>
-              </w:rPr>
-              <w:tab/>
-            </w:r>
-            <w:r>
-              <w:rPr>
-                <w:rStyle w:val="Lienhypertexte"/>
-                <w:noProof/>
-              </w:rPr>
-              <w:t>CA-02.2</w:t>
-            </w:r>
-            <w:r>
-              <w:rPr>
-                <w:noProof/>
-                <w:webHidden/>
-              </w:rPr>
-              <w:tab/>
-            </w:r>
-            <w:r>
-              <w:rPr>
-                <w:noProof/>
-                <w:webHidden/>
-              </w:rPr>
-              <w:fldChar w:fldCharType="begin"/>
-            </w:r>
-            <w:r>
-              <w:rPr>
-                <w:noProof/>
-                <w:webHidden/>
-              </w:rPr>
-              <w:instrText xml:space="preserve"> PAGEREF _Toc242695054 \h </w:instrText>
+              <w:instrText xml:space="preserve"> PAGEREF _Toc242870901 \h </w:instrText>
             </w:r>
             <w:r>
               <w:rPr>
@@ -1078,13 +808,13 @@
               <w:lang w:eastAsia="fr-FR"/>
             </w:rPr>
           </w:pPr>
-          <w:hyperlink w:anchor="_Toc242695055" w:history="1">
+          <w:hyperlink w:anchor="_Toc242870902" w:history="1">
             <w:r>
               <w:rPr>
                 <w:rStyle w:val="Lienhypertexte"/>
                 <w:noProof/>
               </w:rPr>
-              <w:t>I. 3.</w:t>
+              <w:t>II. 3.</w:t>
             </w:r>
             <w:r>
               <w:rPr>
@@ -1101,7 +831,7 @@
                 <w:rStyle w:val="Lienhypertexte"/>
                 <w:noProof/>
               </w:rPr>
-              <w:t>US-03</w:t>
+              <w:t>Lien vers la PR</w:t>
             </w:r>
             <w:r>
               <w:rPr>
@@ -1122,7 +852,7 @@
                 <w:noProof/>
                 <w:webHidden/>
               </w:rPr>
-              <w:instrText xml:space="preserve"> PAGEREF _Toc242695055 \h </w:instrText>
+              <w:instrText xml:space="preserve"> PAGEREF _Toc242870902 \h </w:instrText>
             </w:r>
             <w:r>
               <w:rPr>
@@ -1143,3138 +873,6 @@
                 <w:webHidden/>
               </w:rPr>
               <w:t>3</w:t>
-            </w:r>
-            <w:r>
-              <w:rPr>
-                <w:noProof/>
-                <w:webHidden/>
-              </w:rPr>
-              <w:fldChar w:fldCharType="end"/>
-            </w:r>
-          </w:hyperlink>
-        </w:p>
-        <w:p>
-          <w:pPr>
-            <w:pStyle w:val="TM3"/>
-            <w:tabs>
-              <w:tab w:val="left" w:pos="960"/>
-              <w:tab w:val="right" w:leader="dot" w:pos="9062"/>
-            </w:tabs>
-            <w:rPr>
-              <w:rFonts w:asciiTheme="minorHAnsi" w:eastAsiaTheme="minorEastAsia" w:hAnsiTheme="minorHAnsi"/>
-              <w:noProof/>
-              <w:spacing w:val="0"/>
-              <w:sz w:val="24"/>
-              <w:lang w:eastAsia="fr-FR"/>
-            </w:rPr>
-          </w:pPr>
-          <w:hyperlink w:anchor="_Toc242695056" w:history="1">
-            <w:r>
-              <w:rPr>
-                <w:rStyle w:val="Lienhypertexte"/>
-                <w:noProof/>
-              </w:rPr>
-              <w:t>a.</w:t>
-            </w:r>
-            <w:r>
-              <w:rPr>
-                <w:rFonts w:asciiTheme="minorHAnsi" w:eastAsiaTheme="minorEastAsia" w:hAnsiTheme="minorHAnsi"/>
-                <w:noProof/>
-                <w:spacing w:val="0"/>
-                <w:sz w:val="24"/>
-                <w:lang w:eastAsia="fr-FR"/>
-              </w:rPr>
-              <w:tab/>
-            </w:r>
-            <w:r>
-              <w:rPr>
-                <w:rStyle w:val="Lienhypertexte"/>
-                <w:noProof/>
-              </w:rPr>
-              <w:t>CA-03.1</w:t>
-            </w:r>
-            <w:r>
-              <w:rPr>
-                <w:noProof/>
-                <w:webHidden/>
-              </w:rPr>
-              <w:tab/>
-            </w:r>
-            <w:r>
-              <w:rPr>
-                <w:noProof/>
-                <w:webHidden/>
-              </w:rPr>
-              <w:fldChar w:fldCharType="begin"/>
-            </w:r>
-            <w:r>
-              <w:rPr>
-                <w:noProof/>
-                <w:webHidden/>
-              </w:rPr>
-              <w:instrText xml:space="preserve"> PAGEREF _Toc242695056 \h </w:instrText>
-            </w:r>
-            <w:r>
-              <w:rPr>
-                <w:noProof/>
-                <w:webHidden/>
-              </w:rPr>
-            </w:r>
-            <w:r>
-              <w:rPr>
-                <w:noProof/>
-                <w:webHidden/>
-              </w:rPr>
-              <w:fldChar w:fldCharType="separate"/>
-            </w:r>
-            <w:r>
-              <w:rPr>
-                <w:noProof/>
-                <w:webHidden/>
-              </w:rPr>
-              <w:t>3</w:t>
-            </w:r>
-            <w:r>
-              <w:rPr>
-                <w:noProof/>
-                <w:webHidden/>
-              </w:rPr>
-              <w:fldChar w:fldCharType="end"/>
-            </w:r>
-          </w:hyperlink>
-        </w:p>
-        <w:p>
-          <w:pPr>
-            <w:pStyle w:val="TM3"/>
-            <w:tabs>
-              <w:tab w:val="left" w:pos="960"/>
-              <w:tab w:val="right" w:leader="dot" w:pos="9062"/>
-            </w:tabs>
-            <w:rPr>
-              <w:rFonts w:asciiTheme="minorHAnsi" w:eastAsiaTheme="minorEastAsia" w:hAnsiTheme="minorHAnsi"/>
-              <w:noProof/>
-              <w:spacing w:val="0"/>
-              <w:sz w:val="24"/>
-              <w:lang w:eastAsia="fr-FR"/>
-            </w:rPr>
-          </w:pPr>
-          <w:hyperlink w:anchor="_Toc242695057" w:history="1">
-            <w:r>
-              <w:rPr>
-                <w:rStyle w:val="Lienhypertexte"/>
-                <w:noProof/>
-              </w:rPr>
-              <w:t>b.</w:t>
-            </w:r>
-            <w:r>
-              <w:rPr>
-                <w:rFonts w:asciiTheme="minorHAnsi" w:eastAsiaTheme="minorEastAsia" w:hAnsiTheme="minorHAnsi"/>
-                <w:noProof/>
-                <w:spacing w:val="0"/>
-                <w:sz w:val="24"/>
-                <w:lang w:eastAsia="fr-FR"/>
-              </w:rPr>
-              <w:tab/>
-            </w:r>
-            <w:r>
-              <w:rPr>
-                <w:rStyle w:val="Lienhypertexte"/>
-                <w:noProof/>
-              </w:rPr>
-              <w:t>CA-03.2</w:t>
-            </w:r>
-            <w:r>
-              <w:rPr>
-                <w:noProof/>
-                <w:webHidden/>
-              </w:rPr>
-              <w:tab/>
-            </w:r>
-            <w:r>
-              <w:rPr>
-                <w:noProof/>
-                <w:webHidden/>
-              </w:rPr>
-              <w:fldChar w:fldCharType="begin"/>
-            </w:r>
-            <w:r>
-              <w:rPr>
-                <w:noProof/>
-                <w:webHidden/>
-              </w:rPr>
-              <w:instrText xml:space="preserve"> PAGEREF _Toc242695057 \h </w:instrText>
-            </w:r>
-            <w:r>
-              <w:rPr>
-                <w:noProof/>
-                <w:webHidden/>
-              </w:rPr>
-            </w:r>
-            <w:r>
-              <w:rPr>
-                <w:noProof/>
-                <w:webHidden/>
-              </w:rPr>
-              <w:fldChar w:fldCharType="separate"/>
-            </w:r>
-            <w:r>
-              <w:rPr>
-                <w:noProof/>
-                <w:webHidden/>
-              </w:rPr>
-              <w:t>3</w:t>
-            </w:r>
-            <w:r>
-              <w:rPr>
-                <w:noProof/>
-                <w:webHidden/>
-              </w:rPr>
-              <w:fldChar w:fldCharType="end"/>
-            </w:r>
-          </w:hyperlink>
-        </w:p>
-        <w:p>
-          <w:pPr>
-            <w:pStyle w:val="TM2"/>
-            <w:tabs>
-              <w:tab w:val="left" w:pos="960"/>
-              <w:tab w:val="right" w:leader="dot" w:pos="9062"/>
-            </w:tabs>
-            <w:rPr>
-              <w:rFonts w:asciiTheme="minorHAnsi" w:eastAsiaTheme="minorEastAsia" w:hAnsiTheme="minorHAnsi"/>
-              <w:noProof/>
-              <w:spacing w:val="0"/>
-              <w:sz w:val="24"/>
-              <w:lang w:eastAsia="fr-FR"/>
-            </w:rPr>
-          </w:pPr>
-          <w:hyperlink w:anchor="_Toc242695058" w:history="1">
-            <w:r>
-              <w:rPr>
-                <w:rStyle w:val="Lienhypertexte"/>
-                <w:noProof/>
-              </w:rPr>
-              <w:t>I. 4.</w:t>
-            </w:r>
-            <w:r>
-              <w:rPr>
-                <w:rFonts w:asciiTheme="minorHAnsi" w:eastAsiaTheme="minorEastAsia" w:hAnsiTheme="minorHAnsi"/>
-                <w:noProof/>
-                <w:spacing w:val="0"/>
-                <w:sz w:val="24"/>
-                <w:lang w:eastAsia="fr-FR"/>
-              </w:rPr>
-              <w:tab/>
-            </w:r>
-            <w:r>
-              <w:rPr>
-                <w:rStyle w:val="Lienhypertexte"/>
-                <w:noProof/>
-              </w:rPr>
-              <w:t>US-05</w:t>
-            </w:r>
-            <w:r>
-              <w:rPr>
-                <w:noProof/>
-                <w:webHidden/>
-              </w:rPr>
-              <w:tab/>
-            </w:r>
-            <w:r>
-              <w:rPr>
-                <w:noProof/>
-                <w:webHidden/>
-              </w:rPr>
-              <w:fldChar w:fldCharType="begin"/>
-            </w:r>
-            <w:r>
-              <w:rPr>
-                <w:noProof/>
-                <w:webHidden/>
-              </w:rPr>
-              <w:instrText xml:space="preserve"> PAGEREF _Toc242695058 \h </w:instrText>
-            </w:r>
-            <w:r>
-              <w:rPr>
-                <w:noProof/>
-                <w:webHidden/>
-              </w:rPr>
-            </w:r>
-            <w:r>
-              <w:rPr>
-                <w:noProof/>
-                <w:webHidden/>
-              </w:rPr>
-              <w:fldChar w:fldCharType="separate"/>
-            </w:r>
-            <w:r>
-              <w:rPr>
-                <w:noProof/>
-                <w:webHidden/>
-              </w:rPr>
-              <w:t>3</w:t>
-            </w:r>
-            <w:r>
-              <w:rPr>
-                <w:noProof/>
-                <w:webHidden/>
-              </w:rPr>
-              <w:fldChar w:fldCharType="end"/>
-            </w:r>
-          </w:hyperlink>
-        </w:p>
-        <w:p>
-          <w:pPr>
-            <w:pStyle w:val="TM3"/>
-            <w:tabs>
-              <w:tab w:val="left" w:pos="960"/>
-              <w:tab w:val="right" w:leader="dot" w:pos="9062"/>
-            </w:tabs>
-            <w:rPr>
-              <w:rFonts w:asciiTheme="minorHAnsi" w:eastAsiaTheme="minorEastAsia" w:hAnsiTheme="minorHAnsi"/>
-              <w:noProof/>
-              <w:spacing w:val="0"/>
-              <w:sz w:val="24"/>
-              <w:lang w:eastAsia="fr-FR"/>
-            </w:rPr>
-          </w:pPr>
-          <w:hyperlink w:anchor="_Toc242695059" w:history="1">
-            <w:r>
-              <w:rPr>
-                <w:rStyle w:val="Lienhypertexte"/>
-                <w:noProof/>
-              </w:rPr>
-              <w:t>a.</w:t>
-            </w:r>
-            <w:r>
-              <w:rPr>
-                <w:rFonts w:asciiTheme="minorHAnsi" w:eastAsiaTheme="minorEastAsia" w:hAnsiTheme="minorHAnsi"/>
-                <w:noProof/>
-                <w:spacing w:val="0"/>
-                <w:sz w:val="24"/>
-                <w:lang w:eastAsia="fr-FR"/>
-              </w:rPr>
-              <w:tab/>
-            </w:r>
-            <w:r>
-              <w:rPr>
-                <w:rStyle w:val="Lienhypertexte"/>
-                <w:noProof/>
-              </w:rPr>
-              <w:t>CA-05.1</w:t>
-            </w:r>
-            <w:r>
-              <w:rPr>
-                <w:noProof/>
-                <w:webHidden/>
-              </w:rPr>
-              <w:tab/>
-            </w:r>
-            <w:r>
-              <w:rPr>
-                <w:noProof/>
-                <w:webHidden/>
-              </w:rPr>
-              <w:fldChar w:fldCharType="begin"/>
-            </w:r>
-            <w:r>
-              <w:rPr>
-                <w:noProof/>
-                <w:webHidden/>
-              </w:rPr>
-              <w:instrText xml:space="preserve"> PAGEREF _Toc242695059 \h </w:instrText>
-            </w:r>
-            <w:r>
-              <w:rPr>
-                <w:noProof/>
-                <w:webHidden/>
-              </w:rPr>
-            </w:r>
-            <w:r>
-              <w:rPr>
-                <w:noProof/>
-                <w:webHidden/>
-              </w:rPr>
-              <w:fldChar w:fldCharType="separate"/>
-            </w:r>
-            <w:r>
-              <w:rPr>
-                <w:noProof/>
-                <w:webHidden/>
-              </w:rPr>
-              <w:t>3</w:t>
-            </w:r>
-            <w:r>
-              <w:rPr>
-                <w:noProof/>
-                <w:webHidden/>
-              </w:rPr>
-              <w:fldChar w:fldCharType="end"/>
-            </w:r>
-          </w:hyperlink>
-        </w:p>
-        <w:p>
-          <w:pPr>
-            <w:pStyle w:val="TM3"/>
-            <w:tabs>
-              <w:tab w:val="left" w:pos="960"/>
-              <w:tab w:val="right" w:leader="dot" w:pos="9062"/>
-            </w:tabs>
-            <w:rPr>
-              <w:rFonts w:asciiTheme="minorHAnsi" w:eastAsiaTheme="minorEastAsia" w:hAnsiTheme="minorHAnsi"/>
-              <w:noProof/>
-              <w:spacing w:val="0"/>
-              <w:sz w:val="24"/>
-              <w:lang w:eastAsia="fr-FR"/>
-            </w:rPr>
-          </w:pPr>
-          <w:hyperlink w:anchor="_Toc242695060" w:history="1">
-            <w:r>
-              <w:rPr>
-                <w:rStyle w:val="Lienhypertexte"/>
-                <w:noProof/>
-              </w:rPr>
-              <w:t>b.</w:t>
-            </w:r>
-            <w:r>
-              <w:rPr>
-                <w:rFonts w:asciiTheme="minorHAnsi" w:eastAsiaTheme="minorEastAsia" w:hAnsiTheme="minorHAnsi"/>
-                <w:noProof/>
-                <w:spacing w:val="0"/>
-                <w:sz w:val="24"/>
-                <w:lang w:eastAsia="fr-FR"/>
-              </w:rPr>
-              <w:tab/>
-            </w:r>
-            <w:r>
-              <w:rPr>
-                <w:rStyle w:val="Lienhypertexte"/>
-                <w:noProof/>
-              </w:rPr>
-              <w:t>CA-05.2</w:t>
-            </w:r>
-            <w:r>
-              <w:rPr>
-                <w:noProof/>
-                <w:webHidden/>
-              </w:rPr>
-              <w:tab/>
-            </w:r>
-            <w:r>
-              <w:rPr>
-                <w:noProof/>
-                <w:webHidden/>
-              </w:rPr>
-              <w:fldChar w:fldCharType="begin"/>
-            </w:r>
-            <w:r>
-              <w:rPr>
-                <w:noProof/>
-                <w:webHidden/>
-              </w:rPr>
-              <w:instrText xml:space="preserve"> PAGEREF _Toc242695060 \h </w:instrText>
-            </w:r>
-            <w:r>
-              <w:rPr>
-                <w:noProof/>
-                <w:webHidden/>
-              </w:rPr>
-            </w:r>
-            <w:r>
-              <w:rPr>
-                <w:noProof/>
-                <w:webHidden/>
-              </w:rPr>
-              <w:fldChar w:fldCharType="separate"/>
-            </w:r>
-            <w:r>
-              <w:rPr>
-                <w:noProof/>
-                <w:webHidden/>
-              </w:rPr>
-              <w:t>3</w:t>
-            </w:r>
-            <w:r>
-              <w:rPr>
-                <w:noProof/>
-                <w:webHidden/>
-              </w:rPr>
-              <w:fldChar w:fldCharType="end"/>
-            </w:r>
-          </w:hyperlink>
-        </w:p>
-        <w:p>
-          <w:pPr>
-            <w:pStyle w:val="TM2"/>
-            <w:tabs>
-              <w:tab w:val="left" w:pos="960"/>
-              <w:tab w:val="right" w:leader="dot" w:pos="9062"/>
-            </w:tabs>
-            <w:rPr>
-              <w:rFonts w:asciiTheme="minorHAnsi" w:eastAsiaTheme="minorEastAsia" w:hAnsiTheme="minorHAnsi"/>
-              <w:noProof/>
-              <w:spacing w:val="0"/>
-              <w:sz w:val="24"/>
-              <w:lang w:eastAsia="fr-FR"/>
-            </w:rPr>
-          </w:pPr>
-          <w:hyperlink w:anchor="_Toc242695061" w:history="1">
-            <w:r>
-              <w:rPr>
-                <w:rStyle w:val="Lienhypertexte"/>
-                <w:noProof/>
-              </w:rPr>
-              <w:t>I. 5.</w:t>
-            </w:r>
-            <w:r>
-              <w:rPr>
-                <w:rFonts w:asciiTheme="minorHAnsi" w:eastAsiaTheme="minorEastAsia" w:hAnsiTheme="minorHAnsi"/>
-                <w:noProof/>
-                <w:spacing w:val="0"/>
-                <w:sz w:val="24"/>
-                <w:lang w:eastAsia="fr-FR"/>
-              </w:rPr>
-              <w:tab/>
-            </w:r>
-            <w:r>
-              <w:rPr>
-                <w:rStyle w:val="Lienhypertexte"/>
-                <w:noProof/>
-              </w:rPr>
-              <w:t>US-06</w:t>
-            </w:r>
-            <w:r>
-              <w:rPr>
-                <w:noProof/>
-                <w:webHidden/>
-              </w:rPr>
-              <w:tab/>
-            </w:r>
-            <w:r>
-              <w:rPr>
-                <w:noProof/>
-                <w:webHidden/>
-              </w:rPr>
-              <w:fldChar w:fldCharType="begin"/>
-            </w:r>
-            <w:r>
-              <w:rPr>
-                <w:noProof/>
-                <w:webHidden/>
-              </w:rPr>
-              <w:instrText xml:space="preserve"> PAGEREF _Toc242695061 \h </w:instrText>
-            </w:r>
-            <w:r>
-              <w:rPr>
-                <w:noProof/>
-                <w:webHidden/>
-              </w:rPr>
-            </w:r>
-            <w:r>
-              <w:rPr>
-                <w:noProof/>
-                <w:webHidden/>
-              </w:rPr>
-              <w:fldChar w:fldCharType="separate"/>
-            </w:r>
-            <w:r>
-              <w:rPr>
-                <w:noProof/>
-                <w:webHidden/>
-              </w:rPr>
-              <w:t>4</w:t>
-            </w:r>
-            <w:r>
-              <w:rPr>
-                <w:noProof/>
-                <w:webHidden/>
-              </w:rPr>
-              <w:fldChar w:fldCharType="end"/>
-            </w:r>
-          </w:hyperlink>
-        </w:p>
-        <w:p>
-          <w:pPr>
-            <w:pStyle w:val="TM3"/>
-            <w:tabs>
-              <w:tab w:val="left" w:pos="960"/>
-              <w:tab w:val="right" w:leader="dot" w:pos="9062"/>
-            </w:tabs>
-            <w:rPr>
-              <w:rFonts w:asciiTheme="minorHAnsi" w:eastAsiaTheme="minorEastAsia" w:hAnsiTheme="minorHAnsi"/>
-              <w:noProof/>
-              <w:spacing w:val="0"/>
-              <w:sz w:val="24"/>
-              <w:lang w:eastAsia="fr-FR"/>
-            </w:rPr>
-          </w:pPr>
-          <w:hyperlink w:anchor="_Toc242695062" w:history="1">
-            <w:r>
-              <w:rPr>
-                <w:rStyle w:val="Lienhypertexte"/>
-                <w:noProof/>
-              </w:rPr>
-              <w:t>a.</w:t>
-            </w:r>
-            <w:r>
-              <w:rPr>
-                <w:rFonts w:asciiTheme="minorHAnsi" w:eastAsiaTheme="minorEastAsia" w:hAnsiTheme="minorHAnsi"/>
-                <w:noProof/>
-                <w:spacing w:val="0"/>
-                <w:sz w:val="24"/>
-                <w:lang w:eastAsia="fr-FR"/>
-              </w:rPr>
-              <w:tab/>
-            </w:r>
-            <w:r>
-              <w:rPr>
-                <w:rStyle w:val="Lienhypertexte"/>
-                <w:noProof/>
-              </w:rPr>
-              <w:t>CA-06.1</w:t>
-            </w:r>
-            <w:r>
-              <w:rPr>
-                <w:noProof/>
-                <w:webHidden/>
-              </w:rPr>
-              <w:tab/>
-            </w:r>
-            <w:r>
-              <w:rPr>
-                <w:noProof/>
-                <w:webHidden/>
-              </w:rPr>
-              <w:fldChar w:fldCharType="begin"/>
-            </w:r>
-            <w:r>
-              <w:rPr>
-                <w:noProof/>
-                <w:webHidden/>
-              </w:rPr>
-              <w:instrText xml:space="preserve"> PAGEREF _Toc242695062 \h </w:instrText>
-            </w:r>
-            <w:r>
-              <w:rPr>
-                <w:noProof/>
-                <w:webHidden/>
-              </w:rPr>
-            </w:r>
-            <w:r>
-              <w:rPr>
-                <w:noProof/>
-                <w:webHidden/>
-              </w:rPr>
-              <w:fldChar w:fldCharType="separate"/>
-            </w:r>
-            <w:r>
-              <w:rPr>
-                <w:noProof/>
-                <w:webHidden/>
-              </w:rPr>
-              <w:t>4</w:t>
-            </w:r>
-            <w:r>
-              <w:rPr>
-                <w:noProof/>
-                <w:webHidden/>
-              </w:rPr>
-              <w:fldChar w:fldCharType="end"/>
-            </w:r>
-          </w:hyperlink>
-        </w:p>
-        <w:p>
-          <w:pPr>
-            <w:pStyle w:val="TM3"/>
-            <w:tabs>
-              <w:tab w:val="left" w:pos="960"/>
-              <w:tab w:val="right" w:leader="dot" w:pos="9062"/>
-            </w:tabs>
-            <w:rPr>
-              <w:rFonts w:asciiTheme="minorHAnsi" w:eastAsiaTheme="minorEastAsia" w:hAnsiTheme="minorHAnsi"/>
-              <w:noProof/>
-              <w:spacing w:val="0"/>
-              <w:sz w:val="24"/>
-              <w:lang w:eastAsia="fr-FR"/>
-            </w:rPr>
-          </w:pPr>
-          <w:hyperlink w:anchor="_Toc242695063" w:history="1">
-            <w:r>
-              <w:rPr>
-                <w:rStyle w:val="Lienhypertexte"/>
-                <w:noProof/>
-              </w:rPr>
-              <w:t>b.</w:t>
-            </w:r>
-            <w:r>
-              <w:rPr>
-                <w:rFonts w:asciiTheme="minorHAnsi" w:eastAsiaTheme="minorEastAsia" w:hAnsiTheme="minorHAnsi"/>
-                <w:noProof/>
-                <w:spacing w:val="0"/>
-                <w:sz w:val="24"/>
-                <w:lang w:eastAsia="fr-FR"/>
-              </w:rPr>
-              <w:tab/>
-            </w:r>
-            <w:r>
-              <w:rPr>
-                <w:rStyle w:val="Lienhypertexte"/>
-                <w:noProof/>
-              </w:rPr>
-              <w:t>CA-06.2</w:t>
-            </w:r>
-            <w:r>
-              <w:rPr>
-                <w:noProof/>
-                <w:webHidden/>
-              </w:rPr>
-              <w:tab/>
-            </w:r>
-            <w:r>
-              <w:rPr>
-                <w:noProof/>
-                <w:webHidden/>
-              </w:rPr>
-              <w:fldChar w:fldCharType="begin"/>
-            </w:r>
-            <w:r>
-              <w:rPr>
-                <w:noProof/>
-                <w:webHidden/>
-              </w:rPr>
-              <w:instrText xml:space="preserve"> PAGEREF _Toc242695063 \h </w:instrText>
-            </w:r>
-            <w:r>
-              <w:rPr>
-                <w:noProof/>
-                <w:webHidden/>
-              </w:rPr>
-            </w:r>
-            <w:r>
-              <w:rPr>
-                <w:noProof/>
-                <w:webHidden/>
-              </w:rPr>
-              <w:fldChar w:fldCharType="separate"/>
-            </w:r>
-            <w:r>
-              <w:rPr>
-                <w:noProof/>
-                <w:webHidden/>
-              </w:rPr>
-              <w:t>4</w:t>
-            </w:r>
-            <w:r>
-              <w:rPr>
-                <w:noProof/>
-                <w:webHidden/>
-              </w:rPr>
-              <w:fldChar w:fldCharType="end"/>
-            </w:r>
-          </w:hyperlink>
-        </w:p>
-        <w:p>
-          <w:pPr>
-            <w:pStyle w:val="TM2"/>
-            <w:tabs>
-              <w:tab w:val="left" w:pos="960"/>
-              <w:tab w:val="right" w:leader="dot" w:pos="9062"/>
-            </w:tabs>
-            <w:rPr>
-              <w:rFonts w:asciiTheme="minorHAnsi" w:eastAsiaTheme="minorEastAsia" w:hAnsiTheme="minorHAnsi"/>
-              <w:noProof/>
-              <w:spacing w:val="0"/>
-              <w:sz w:val="24"/>
-              <w:lang w:eastAsia="fr-FR"/>
-            </w:rPr>
-          </w:pPr>
-          <w:hyperlink w:anchor="_Toc242695064" w:history="1">
-            <w:r>
-              <w:rPr>
-                <w:rStyle w:val="Lienhypertexte"/>
-                <w:noProof/>
-              </w:rPr>
-              <w:t>I. 6.</w:t>
-            </w:r>
-            <w:r>
-              <w:rPr>
-                <w:rFonts w:asciiTheme="minorHAnsi" w:eastAsiaTheme="minorEastAsia" w:hAnsiTheme="minorHAnsi"/>
-                <w:noProof/>
-                <w:spacing w:val="0"/>
-                <w:sz w:val="24"/>
-                <w:lang w:eastAsia="fr-FR"/>
-              </w:rPr>
-              <w:tab/>
-            </w:r>
-            <w:r>
-              <w:rPr>
-                <w:rStyle w:val="Lienhypertexte"/>
-                <w:noProof/>
-              </w:rPr>
-              <w:t>US-07</w:t>
-            </w:r>
-            <w:r>
-              <w:rPr>
-                <w:noProof/>
-                <w:webHidden/>
-              </w:rPr>
-              <w:tab/>
-            </w:r>
-            <w:r>
-              <w:rPr>
-                <w:noProof/>
-                <w:webHidden/>
-              </w:rPr>
-              <w:fldChar w:fldCharType="begin"/>
-            </w:r>
-            <w:r>
-              <w:rPr>
-                <w:noProof/>
-                <w:webHidden/>
-              </w:rPr>
-              <w:instrText xml:space="preserve"> PAGEREF _Toc242695064 \h </w:instrText>
-            </w:r>
-            <w:r>
-              <w:rPr>
-                <w:noProof/>
-                <w:webHidden/>
-              </w:rPr>
-            </w:r>
-            <w:r>
-              <w:rPr>
-                <w:noProof/>
-                <w:webHidden/>
-              </w:rPr>
-              <w:fldChar w:fldCharType="separate"/>
-            </w:r>
-            <w:r>
-              <w:rPr>
-                <w:noProof/>
-                <w:webHidden/>
-              </w:rPr>
-              <w:t>4</w:t>
-            </w:r>
-            <w:r>
-              <w:rPr>
-                <w:noProof/>
-                <w:webHidden/>
-              </w:rPr>
-              <w:fldChar w:fldCharType="end"/>
-            </w:r>
-          </w:hyperlink>
-        </w:p>
-        <w:p>
-          <w:pPr>
-            <w:pStyle w:val="TM3"/>
-            <w:tabs>
-              <w:tab w:val="left" w:pos="960"/>
-              <w:tab w:val="right" w:leader="dot" w:pos="9062"/>
-            </w:tabs>
-            <w:rPr>
-              <w:rFonts w:asciiTheme="minorHAnsi" w:eastAsiaTheme="minorEastAsia" w:hAnsiTheme="minorHAnsi"/>
-              <w:noProof/>
-              <w:spacing w:val="0"/>
-              <w:sz w:val="24"/>
-              <w:lang w:eastAsia="fr-FR"/>
-            </w:rPr>
-          </w:pPr>
-          <w:hyperlink w:anchor="_Toc242695065" w:history="1">
-            <w:r>
-              <w:rPr>
-                <w:rStyle w:val="Lienhypertexte"/>
-                <w:noProof/>
-              </w:rPr>
-              <w:t>a.</w:t>
-            </w:r>
-            <w:r>
-              <w:rPr>
-                <w:rFonts w:asciiTheme="minorHAnsi" w:eastAsiaTheme="minorEastAsia" w:hAnsiTheme="minorHAnsi"/>
-                <w:noProof/>
-                <w:spacing w:val="0"/>
-                <w:sz w:val="24"/>
-                <w:lang w:eastAsia="fr-FR"/>
-              </w:rPr>
-              <w:tab/>
-            </w:r>
-            <w:r>
-              <w:rPr>
-                <w:rStyle w:val="Lienhypertexte"/>
-                <w:noProof/>
-              </w:rPr>
-              <w:t>CA-07.1</w:t>
-            </w:r>
-            <w:r>
-              <w:rPr>
-                <w:noProof/>
-                <w:webHidden/>
-              </w:rPr>
-              <w:tab/>
-            </w:r>
-            <w:r>
-              <w:rPr>
-                <w:noProof/>
-                <w:webHidden/>
-              </w:rPr>
-              <w:fldChar w:fldCharType="begin"/>
-            </w:r>
-            <w:r>
-              <w:rPr>
-                <w:noProof/>
-                <w:webHidden/>
-              </w:rPr>
-              <w:instrText xml:space="preserve"> PAGEREF _Toc242695065 \h </w:instrText>
-            </w:r>
-            <w:r>
-              <w:rPr>
-                <w:noProof/>
-                <w:webHidden/>
-              </w:rPr>
-            </w:r>
-            <w:r>
-              <w:rPr>
-                <w:noProof/>
-                <w:webHidden/>
-              </w:rPr>
-              <w:fldChar w:fldCharType="separate"/>
-            </w:r>
-            <w:r>
-              <w:rPr>
-                <w:noProof/>
-                <w:webHidden/>
-              </w:rPr>
-              <w:t>4</w:t>
-            </w:r>
-            <w:r>
-              <w:rPr>
-                <w:noProof/>
-                <w:webHidden/>
-              </w:rPr>
-              <w:fldChar w:fldCharType="end"/>
-            </w:r>
-          </w:hyperlink>
-        </w:p>
-        <w:p>
-          <w:pPr>
-            <w:pStyle w:val="TM2"/>
-            <w:tabs>
-              <w:tab w:val="left" w:pos="960"/>
-              <w:tab w:val="right" w:leader="dot" w:pos="9062"/>
-            </w:tabs>
-            <w:rPr>
-              <w:rFonts w:asciiTheme="minorHAnsi" w:eastAsiaTheme="minorEastAsia" w:hAnsiTheme="minorHAnsi"/>
-              <w:noProof/>
-              <w:spacing w:val="0"/>
-              <w:sz w:val="24"/>
-              <w:lang w:eastAsia="fr-FR"/>
-            </w:rPr>
-          </w:pPr>
-          <w:hyperlink w:anchor="_Toc242695066" w:history="1">
-            <w:r>
-              <w:rPr>
-                <w:rStyle w:val="Lienhypertexte"/>
-                <w:noProof/>
-              </w:rPr>
-              <w:t>I. 7.</w:t>
-            </w:r>
-            <w:r>
-              <w:rPr>
-                <w:rFonts w:asciiTheme="minorHAnsi" w:eastAsiaTheme="minorEastAsia" w:hAnsiTheme="minorHAnsi"/>
-                <w:noProof/>
-                <w:spacing w:val="0"/>
-                <w:sz w:val="24"/>
-                <w:lang w:eastAsia="fr-FR"/>
-              </w:rPr>
-              <w:tab/>
-            </w:r>
-            <w:r>
-              <w:rPr>
-                <w:rStyle w:val="Lienhypertexte"/>
-                <w:noProof/>
-              </w:rPr>
-              <w:t>US-09</w:t>
-            </w:r>
-            <w:r>
-              <w:rPr>
-                <w:noProof/>
-                <w:webHidden/>
-              </w:rPr>
-              <w:tab/>
-            </w:r>
-            <w:r>
-              <w:rPr>
-                <w:noProof/>
-                <w:webHidden/>
-              </w:rPr>
-              <w:fldChar w:fldCharType="begin"/>
-            </w:r>
-            <w:r>
-              <w:rPr>
-                <w:noProof/>
-                <w:webHidden/>
-              </w:rPr>
-              <w:instrText xml:space="preserve"> PAGEREF _Toc242695066 \h </w:instrText>
-            </w:r>
-            <w:r>
-              <w:rPr>
-                <w:noProof/>
-                <w:webHidden/>
-              </w:rPr>
-            </w:r>
-            <w:r>
-              <w:rPr>
-                <w:noProof/>
-                <w:webHidden/>
-              </w:rPr>
-              <w:fldChar w:fldCharType="separate"/>
-            </w:r>
-            <w:r>
-              <w:rPr>
-                <w:noProof/>
-                <w:webHidden/>
-              </w:rPr>
-              <w:t>4</w:t>
-            </w:r>
-            <w:r>
-              <w:rPr>
-                <w:noProof/>
-                <w:webHidden/>
-              </w:rPr>
-              <w:fldChar w:fldCharType="end"/>
-            </w:r>
-          </w:hyperlink>
-        </w:p>
-        <w:p>
-          <w:pPr>
-            <w:pStyle w:val="TM3"/>
-            <w:tabs>
-              <w:tab w:val="left" w:pos="960"/>
-              <w:tab w:val="right" w:leader="dot" w:pos="9062"/>
-            </w:tabs>
-            <w:rPr>
-              <w:rFonts w:asciiTheme="minorHAnsi" w:eastAsiaTheme="minorEastAsia" w:hAnsiTheme="minorHAnsi"/>
-              <w:noProof/>
-              <w:spacing w:val="0"/>
-              <w:sz w:val="24"/>
-              <w:lang w:eastAsia="fr-FR"/>
-            </w:rPr>
-          </w:pPr>
-          <w:hyperlink w:anchor="_Toc242695067" w:history="1">
-            <w:r>
-              <w:rPr>
-                <w:rStyle w:val="Lienhypertexte"/>
-                <w:noProof/>
-              </w:rPr>
-              <w:t>a.</w:t>
-            </w:r>
-            <w:r>
-              <w:rPr>
-                <w:rFonts w:asciiTheme="minorHAnsi" w:eastAsiaTheme="minorEastAsia" w:hAnsiTheme="minorHAnsi"/>
-                <w:noProof/>
-                <w:spacing w:val="0"/>
-                <w:sz w:val="24"/>
-                <w:lang w:eastAsia="fr-FR"/>
-              </w:rPr>
-              <w:tab/>
-            </w:r>
-            <w:r>
-              <w:rPr>
-                <w:rStyle w:val="Lienhypertexte"/>
-                <w:noProof/>
-              </w:rPr>
-              <w:t>CA-09.1</w:t>
-            </w:r>
-            <w:r>
-              <w:rPr>
-                <w:noProof/>
-                <w:webHidden/>
-              </w:rPr>
-              <w:tab/>
-            </w:r>
-            <w:r>
-              <w:rPr>
-                <w:noProof/>
-                <w:webHidden/>
-              </w:rPr>
-              <w:fldChar w:fldCharType="begin"/>
-            </w:r>
-            <w:r>
-              <w:rPr>
-                <w:noProof/>
-                <w:webHidden/>
-              </w:rPr>
-              <w:instrText xml:space="preserve"> PAGEREF _Toc242695067 \h </w:instrText>
-            </w:r>
-            <w:r>
-              <w:rPr>
-                <w:noProof/>
-                <w:webHidden/>
-              </w:rPr>
-            </w:r>
-            <w:r>
-              <w:rPr>
-                <w:noProof/>
-                <w:webHidden/>
-              </w:rPr>
-              <w:fldChar w:fldCharType="separate"/>
-            </w:r>
-            <w:r>
-              <w:rPr>
-                <w:noProof/>
-                <w:webHidden/>
-              </w:rPr>
-              <w:t>4</w:t>
-            </w:r>
-            <w:r>
-              <w:rPr>
-                <w:noProof/>
-                <w:webHidden/>
-              </w:rPr>
-              <w:fldChar w:fldCharType="end"/>
-            </w:r>
-          </w:hyperlink>
-        </w:p>
-        <w:p>
-          <w:pPr>
-            <w:pStyle w:val="TM2"/>
-            <w:tabs>
-              <w:tab w:val="left" w:pos="960"/>
-              <w:tab w:val="right" w:leader="dot" w:pos="9062"/>
-            </w:tabs>
-            <w:rPr>
-              <w:rFonts w:asciiTheme="minorHAnsi" w:eastAsiaTheme="minorEastAsia" w:hAnsiTheme="minorHAnsi"/>
-              <w:noProof/>
-              <w:spacing w:val="0"/>
-              <w:sz w:val="24"/>
-              <w:lang w:eastAsia="fr-FR"/>
-            </w:rPr>
-          </w:pPr>
-          <w:hyperlink w:anchor="_Toc242695068" w:history="1">
-            <w:r>
-              <w:rPr>
-                <w:rStyle w:val="Lienhypertexte"/>
-                <w:noProof/>
-              </w:rPr>
-              <w:t>I. 8.</w:t>
-            </w:r>
-            <w:r>
-              <w:rPr>
-                <w:rFonts w:asciiTheme="minorHAnsi" w:eastAsiaTheme="minorEastAsia" w:hAnsiTheme="minorHAnsi"/>
-                <w:noProof/>
-                <w:spacing w:val="0"/>
-                <w:sz w:val="24"/>
-                <w:lang w:eastAsia="fr-FR"/>
-              </w:rPr>
-              <w:tab/>
-            </w:r>
-            <w:r>
-              <w:rPr>
-                <w:rStyle w:val="Lienhypertexte"/>
-                <w:noProof/>
-              </w:rPr>
-              <w:t>US-10</w:t>
-            </w:r>
-            <w:r>
-              <w:rPr>
-                <w:noProof/>
-                <w:webHidden/>
-              </w:rPr>
-              <w:tab/>
-            </w:r>
-            <w:r>
-              <w:rPr>
-                <w:noProof/>
-                <w:webHidden/>
-              </w:rPr>
-              <w:fldChar w:fldCharType="begin"/>
-            </w:r>
-            <w:r>
-              <w:rPr>
-                <w:noProof/>
-                <w:webHidden/>
-              </w:rPr>
-              <w:instrText xml:space="preserve"> PAGEREF _Toc242695068 \h </w:instrText>
-            </w:r>
-            <w:r>
-              <w:rPr>
-                <w:noProof/>
-                <w:webHidden/>
-              </w:rPr>
-            </w:r>
-            <w:r>
-              <w:rPr>
-                <w:noProof/>
-                <w:webHidden/>
-              </w:rPr>
-              <w:fldChar w:fldCharType="separate"/>
-            </w:r>
-            <w:r>
-              <w:rPr>
-                <w:noProof/>
-                <w:webHidden/>
-              </w:rPr>
-              <w:t>4</w:t>
-            </w:r>
-            <w:r>
-              <w:rPr>
-                <w:noProof/>
-                <w:webHidden/>
-              </w:rPr>
-              <w:fldChar w:fldCharType="end"/>
-            </w:r>
-          </w:hyperlink>
-        </w:p>
-        <w:p>
-          <w:pPr>
-            <w:pStyle w:val="TM3"/>
-            <w:tabs>
-              <w:tab w:val="left" w:pos="960"/>
-              <w:tab w:val="right" w:leader="dot" w:pos="9062"/>
-            </w:tabs>
-            <w:rPr>
-              <w:rFonts w:asciiTheme="minorHAnsi" w:eastAsiaTheme="minorEastAsia" w:hAnsiTheme="minorHAnsi"/>
-              <w:noProof/>
-              <w:spacing w:val="0"/>
-              <w:sz w:val="24"/>
-              <w:lang w:eastAsia="fr-FR"/>
-            </w:rPr>
-          </w:pPr>
-          <w:hyperlink w:anchor="_Toc242695069" w:history="1">
-            <w:r>
-              <w:rPr>
-                <w:rStyle w:val="Lienhypertexte"/>
-                <w:noProof/>
-              </w:rPr>
-              <w:t>a.</w:t>
-            </w:r>
-            <w:r>
-              <w:rPr>
-                <w:rFonts w:asciiTheme="minorHAnsi" w:eastAsiaTheme="minorEastAsia" w:hAnsiTheme="minorHAnsi"/>
-                <w:noProof/>
-                <w:spacing w:val="0"/>
-                <w:sz w:val="24"/>
-                <w:lang w:eastAsia="fr-FR"/>
-              </w:rPr>
-              <w:tab/>
-            </w:r>
-            <w:r>
-              <w:rPr>
-                <w:rStyle w:val="Lienhypertexte"/>
-                <w:noProof/>
-              </w:rPr>
-              <w:t>CA-10.1</w:t>
-            </w:r>
-            <w:r>
-              <w:rPr>
-                <w:noProof/>
-                <w:webHidden/>
-              </w:rPr>
-              <w:tab/>
-            </w:r>
-            <w:r>
-              <w:rPr>
-                <w:noProof/>
-                <w:webHidden/>
-              </w:rPr>
-              <w:fldChar w:fldCharType="begin"/>
-            </w:r>
-            <w:r>
-              <w:rPr>
-                <w:noProof/>
-                <w:webHidden/>
-              </w:rPr>
-              <w:instrText xml:space="preserve"> PAGEREF _Toc242695069 \h </w:instrText>
-            </w:r>
-            <w:r>
-              <w:rPr>
-                <w:noProof/>
-                <w:webHidden/>
-              </w:rPr>
-            </w:r>
-            <w:r>
-              <w:rPr>
-                <w:noProof/>
-                <w:webHidden/>
-              </w:rPr>
-              <w:fldChar w:fldCharType="separate"/>
-            </w:r>
-            <w:r>
-              <w:rPr>
-                <w:noProof/>
-                <w:webHidden/>
-              </w:rPr>
-              <w:t>4</w:t>
-            </w:r>
-            <w:r>
-              <w:rPr>
-                <w:noProof/>
-                <w:webHidden/>
-              </w:rPr>
-              <w:fldChar w:fldCharType="end"/>
-            </w:r>
-          </w:hyperlink>
-        </w:p>
-        <w:p>
-          <w:pPr>
-            <w:pStyle w:val="TM3"/>
-            <w:tabs>
-              <w:tab w:val="left" w:pos="960"/>
-              <w:tab w:val="right" w:leader="dot" w:pos="9062"/>
-            </w:tabs>
-            <w:rPr>
-              <w:rFonts w:asciiTheme="minorHAnsi" w:eastAsiaTheme="minorEastAsia" w:hAnsiTheme="minorHAnsi"/>
-              <w:noProof/>
-              <w:spacing w:val="0"/>
-              <w:sz w:val="24"/>
-              <w:lang w:eastAsia="fr-FR"/>
-            </w:rPr>
-          </w:pPr>
-          <w:hyperlink w:anchor="_Toc242695070" w:history="1">
-            <w:r>
-              <w:rPr>
-                <w:rStyle w:val="Lienhypertexte"/>
-                <w:noProof/>
-              </w:rPr>
-              <w:t>b.</w:t>
-            </w:r>
-            <w:r>
-              <w:rPr>
-                <w:rFonts w:asciiTheme="minorHAnsi" w:eastAsiaTheme="minorEastAsia" w:hAnsiTheme="minorHAnsi"/>
-                <w:noProof/>
-                <w:spacing w:val="0"/>
-                <w:sz w:val="24"/>
-                <w:lang w:eastAsia="fr-FR"/>
-              </w:rPr>
-              <w:tab/>
-            </w:r>
-            <w:r>
-              <w:rPr>
-                <w:rStyle w:val="Lienhypertexte"/>
-                <w:noProof/>
-              </w:rPr>
-              <w:t>CA-10.2</w:t>
-            </w:r>
-            <w:r>
-              <w:rPr>
-                <w:noProof/>
-                <w:webHidden/>
-              </w:rPr>
-              <w:tab/>
-            </w:r>
-            <w:r>
-              <w:rPr>
-                <w:noProof/>
-                <w:webHidden/>
-              </w:rPr>
-              <w:fldChar w:fldCharType="begin"/>
-            </w:r>
-            <w:r>
-              <w:rPr>
-                <w:noProof/>
-                <w:webHidden/>
-              </w:rPr>
-              <w:instrText xml:space="preserve"> PAGEREF _Toc242695070 \h </w:instrText>
-            </w:r>
-            <w:r>
-              <w:rPr>
-                <w:noProof/>
-                <w:webHidden/>
-              </w:rPr>
-            </w:r>
-            <w:r>
-              <w:rPr>
-                <w:noProof/>
-                <w:webHidden/>
-              </w:rPr>
-              <w:fldChar w:fldCharType="separate"/>
-            </w:r>
-            <w:r>
-              <w:rPr>
-                <w:noProof/>
-                <w:webHidden/>
-              </w:rPr>
-              <w:t>4</w:t>
-            </w:r>
-            <w:r>
-              <w:rPr>
-                <w:noProof/>
-                <w:webHidden/>
-              </w:rPr>
-              <w:fldChar w:fldCharType="end"/>
-            </w:r>
-          </w:hyperlink>
-        </w:p>
-        <w:p>
-          <w:pPr>
-            <w:pStyle w:val="TM2"/>
-            <w:tabs>
-              <w:tab w:val="left" w:pos="960"/>
-              <w:tab w:val="right" w:leader="dot" w:pos="9062"/>
-            </w:tabs>
-            <w:rPr>
-              <w:rFonts w:asciiTheme="minorHAnsi" w:eastAsiaTheme="minorEastAsia" w:hAnsiTheme="minorHAnsi"/>
-              <w:noProof/>
-              <w:spacing w:val="0"/>
-              <w:sz w:val="24"/>
-              <w:lang w:eastAsia="fr-FR"/>
-            </w:rPr>
-          </w:pPr>
-          <w:hyperlink w:anchor="_Toc242695071" w:history="1">
-            <w:r>
-              <w:rPr>
-                <w:rStyle w:val="Lienhypertexte"/>
-                <w:noProof/>
-              </w:rPr>
-              <w:t>I. 9.</w:t>
-            </w:r>
-            <w:r>
-              <w:rPr>
-                <w:rFonts w:asciiTheme="minorHAnsi" w:eastAsiaTheme="minorEastAsia" w:hAnsiTheme="minorHAnsi"/>
-                <w:noProof/>
-                <w:spacing w:val="0"/>
-                <w:sz w:val="24"/>
-                <w:lang w:eastAsia="fr-FR"/>
-              </w:rPr>
-              <w:tab/>
-            </w:r>
-            <w:r>
-              <w:rPr>
-                <w:rStyle w:val="Lienhypertexte"/>
-                <w:noProof/>
-              </w:rPr>
-              <w:t>US-11</w:t>
-            </w:r>
-            <w:r>
-              <w:rPr>
-                <w:noProof/>
-                <w:webHidden/>
-              </w:rPr>
-              <w:tab/>
-            </w:r>
-            <w:r>
-              <w:rPr>
-                <w:noProof/>
-                <w:webHidden/>
-              </w:rPr>
-              <w:fldChar w:fldCharType="begin"/>
-            </w:r>
-            <w:r>
-              <w:rPr>
-                <w:noProof/>
-                <w:webHidden/>
-              </w:rPr>
-              <w:instrText xml:space="preserve"> PAGEREF _Toc242695071 \h </w:instrText>
-            </w:r>
-            <w:r>
-              <w:rPr>
-                <w:noProof/>
-                <w:webHidden/>
-              </w:rPr>
-            </w:r>
-            <w:r>
-              <w:rPr>
-                <w:noProof/>
-                <w:webHidden/>
-              </w:rPr>
-              <w:fldChar w:fldCharType="separate"/>
-            </w:r>
-            <w:r>
-              <w:rPr>
-                <w:noProof/>
-                <w:webHidden/>
-              </w:rPr>
-              <w:t>4</w:t>
-            </w:r>
-            <w:r>
-              <w:rPr>
-                <w:noProof/>
-                <w:webHidden/>
-              </w:rPr>
-              <w:fldChar w:fldCharType="end"/>
-            </w:r>
-          </w:hyperlink>
-        </w:p>
-        <w:p>
-          <w:pPr>
-            <w:pStyle w:val="TM3"/>
-            <w:tabs>
-              <w:tab w:val="left" w:pos="960"/>
-              <w:tab w:val="right" w:leader="dot" w:pos="9062"/>
-            </w:tabs>
-            <w:rPr>
-              <w:rFonts w:asciiTheme="minorHAnsi" w:eastAsiaTheme="minorEastAsia" w:hAnsiTheme="minorHAnsi"/>
-              <w:noProof/>
-              <w:spacing w:val="0"/>
-              <w:sz w:val="24"/>
-              <w:lang w:eastAsia="fr-FR"/>
-            </w:rPr>
-          </w:pPr>
-          <w:hyperlink w:anchor="_Toc242695072" w:history="1">
-            <w:r>
-              <w:rPr>
-                <w:rStyle w:val="Lienhypertexte"/>
-                <w:noProof/>
-              </w:rPr>
-              <w:t>a.</w:t>
-            </w:r>
-            <w:r>
-              <w:rPr>
-                <w:rFonts w:asciiTheme="minorHAnsi" w:eastAsiaTheme="minorEastAsia" w:hAnsiTheme="minorHAnsi"/>
-                <w:noProof/>
-                <w:spacing w:val="0"/>
-                <w:sz w:val="24"/>
-                <w:lang w:eastAsia="fr-FR"/>
-              </w:rPr>
-              <w:tab/>
-            </w:r>
-            <w:r>
-              <w:rPr>
-                <w:rStyle w:val="Lienhypertexte"/>
-                <w:noProof/>
-              </w:rPr>
-              <w:t>CA-11.1</w:t>
-            </w:r>
-            <w:r>
-              <w:rPr>
-                <w:noProof/>
-                <w:webHidden/>
-              </w:rPr>
-              <w:tab/>
-            </w:r>
-            <w:r>
-              <w:rPr>
-                <w:noProof/>
-                <w:webHidden/>
-              </w:rPr>
-              <w:fldChar w:fldCharType="begin"/>
-            </w:r>
-            <w:r>
-              <w:rPr>
-                <w:noProof/>
-                <w:webHidden/>
-              </w:rPr>
-              <w:instrText xml:space="preserve"> PAGEREF _Toc242695072 \h </w:instrText>
-            </w:r>
-            <w:r>
-              <w:rPr>
-                <w:noProof/>
-                <w:webHidden/>
-              </w:rPr>
-            </w:r>
-            <w:r>
-              <w:rPr>
-                <w:noProof/>
-                <w:webHidden/>
-              </w:rPr>
-              <w:fldChar w:fldCharType="separate"/>
-            </w:r>
-            <w:r>
-              <w:rPr>
-                <w:noProof/>
-                <w:webHidden/>
-              </w:rPr>
-              <w:t>4</w:t>
-            </w:r>
-            <w:r>
-              <w:rPr>
-                <w:noProof/>
-                <w:webHidden/>
-              </w:rPr>
-              <w:fldChar w:fldCharType="end"/>
-            </w:r>
-          </w:hyperlink>
-        </w:p>
-        <w:p>
-          <w:pPr>
-            <w:pStyle w:val="TM2"/>
-            <w:tabs>
-              <w:tab w:val="left" w:pos="1200"/>
-              <w:tab w:val="right" w:leader="dot" w:pos="9062"/>
-            </w:tabs>
-            <w:rPr>
-              <w:rFonts w:asciiTheme="minorHAnsi" w:eastAsiaTheme="minorEastAsia" w:hAnsiTheme="minorHAnsi"/>
-              <w:noProof/>
-              <w:spacing w:val="0"/>
-              <w:sz w:val="24"/>
-              <w:lang w:eastAsia="fr-FR"/>
-            </w:rPr>
-          </w:pPr>
-          <w:hyperlink w:anchor="_Toc242695073" w:history="1">
-            <w:r>
-              <w:rPr>
-                <w:rStyle w:val="Lienhypertexte"/>
-                <w:noProof/>
-              </w:rPr>
-              <w:t>I. 10.</w:t>
-            </w:r>
-            <w:r>
-              <w:rPr>
-                <w:rFonts w:asciiTheme="minorHAnsi" w:eastAsiaTheme="minorEastAsia" w:hAnsiTheme="minorHAnsi"/>
-                <w:noProof/>
-                <w:spacing w:val="0"/>
-                <w:sz w:val="24"/>
-                <w:lang w:eastAsia="fr-FR"/>
-              </w:rPr>
-              <w:tab/>
-            </w:r>
-            <w:r>
-              <w:rPr>
-                <w:rStyle w:val="Lienhypertexte"/>
-                <w:noProof/>
-              </w:rPr>
-              <w:t>US-13</w:t>
-            </w:r>
-            <w:r>
-              <w:rPr>
-                <w:noProof/>
-                <w:webHidden/>
-              </w:rPr>
-              <w:tab/>
-            </w:r>
-            <w:r>
-              <w:rPr>
-                <w:noProof/>
-                <w:webHidden/>
-              </w:rPr>
-              <w:fldChar w:fldCharType="begin"/>
-            </w:r>
-            <w:r>
-              <w:rPr>
-                <w:noProof/>
-                <w:webHidden/>
-              </w:rPr>
-              <w:instrText xml:space="preserve"> PAGEREF _Toc242695073 \h </w:instrText>
-            </w:r>
-            <w:r>
-              <w:rPr>
-                <w:noProof/>
-                <w:webHidden/>
-              </w:rPr>
-            </w:r>
-            <w:r>
-              <w:rPr>
-                <w:noProof/>
-                <w:webHidden/>
-              </w:rPr>
-              <w:fldChar w:fldCharType="separate"/>
-            </w:r>
-            <w:r>
-              <w:rPr>
-                <w:noProof/>
-                <w:webHidden/>
-              </w:rPr>
-              <w:t>5</w:t>
-            </w:r>
-            <w:r>
-              <w:rPr>
-                <w:noProof/>
-                <w:webHidden/>
-              </w:rPr>
-              <w:fldChar w:fldCharType="end"/>
-            </w:r>
-          </w:hyperlink>
-        </w:p>
-        <w:p>
-          <w:pPr>
-            <w:pStyle w:val="TM3"/>
-            <w:tabs>
-              <w:tab w:val="left" w:pos="960"/>
-              <w:tab w:val="right" w:leader="dot" w:pos="9062"/>
-            </w:tabs>
-            <w:rPr>
-              <w:rFonts w:asciiTheme="minorHAnsi" w:eastAsiaTheme="minorEastAsia" w:hAnsiTheme="minorHAnsi"/>
-              <w:noProof/>
-              <w:spacing w:val="0"/>
-              <w:sz w:val="24"/>
-              <w:lang w:eastAsia="fr-FR"/>
-            </w:rPr>
-          </w:pPr>
-          <w:hyperlink w:anchor="_Toc242695074" w:history="1">
-            <w:r>
-              <w:rPr>
-                <w:rStyle w:val="Lienhypertexte"/>
-                <w:noProof/>
-              </w:rPr>
-              <w:t>a.</w:t>
-            </w:r>
-            <w:r>
-              <w:rPr>
-                <w:rFonts w:asciiTheme="minorHAnsi" w:eastAsiaTheme="minorEastAsia" w:hAnsiTheme="minorHAnsi"/>
-                <w:noProof/>
-                <w:spacing w:val="0"/>
-                <w:sz w:val="24"/>
-                <w:lang w:eastAsia="fr-FR"/>
-              </w:rPr>
-              <w:tab/>
-            </w:r>
-            <w:r>
-              <w:rPr>
-                <w:rStyle w:val="Lienhypertexte"/>
-                <w:noProof/>
-              </w:rPr>
-              <w:t>CA-13.1</w:t>
-            </w:r>
-            <w:r>
-              <w:rPr>
-                <w:noProof/>
-                <w:webHidden/>
-              </w:rPr>
-              <w:tab/>
-            </w:r>
-            <w:r>
-              <w:rPr>
-                <w:noProof/>
-                <w:webHidden/>
-              </w:rPr>
-              <w:fldChar w:fldCharType="begin"/>
-            </w:r>
-            <w:r>
-              <w:rPr>
-                <w:noProof/>
-                <w:webHidden/>
-              </w:rPr>
-              <w:instrText xml:space="preserve"> PAGEREF _Toc242695074 \h </w:instrText>
-            </w:r>
-            <w:r>
-              <w:rPr>
-                <w:noProof/>
-                <w:webHidden/>
-              </w:rPr>
-            </w:r>
-            <w:r>
-              <w:rPr>
-                <w:noProof/>
-                <w:webHidden/>
-              </w:rPr>
-              <w:fldChar w:fldCharType="separate"/>
-            </w:r>
-            <w:r>
-              <w:rPr>
-                <w:noProof/>
-                <w:webHidden/>
-              </w:rPr>
-              <w:t>5</w:t>
-            </w:r>
-            <w:r>
-              <w:rPr>
-                <w:noProof/>
-                <w:webHidden/>
-              </w:rPr>
-              <w:fldChar w:fldCharType="end"/>
-            </w:r>
-          </w:hyperlink>
-        </w:p>
-        <w:p>
-          <w:pPr>
-            <w:pStyle w:val="TM3"/>
-            <w:tabs>
-              <w:tab w:val="left" w:pos="960"/>
-              <w:tab w:val="right" w:leader="dot" w:pos="9062"/>
-            </w:tabs>
-            <w:rPr>
-              <w:rFonts w:asciiTheme="minorHAnsi" w:eastAsiaTheme="minorEastAsia" w:hAnsiTheme="minorHAnsi"/>
-              <w:noProof/>
-              <w:spacing w:val="0"/>
-              <w:sz w:val="24"/>
-              <w:lang w:eastAsia="fr-FR"/>
-            </w:rPr>
-          </w:pPr>
-          <w:hyperlink w:anchor="_Toc242695075" w:history="1">
-            <w:r>
-              <w:rPr>
-                <w:rStyle w:val="Lienhypertexte"/>
-                <w:noProof/>
-              </w:rPr>
-              <w:t>b.</w:t>
-            </w:r>
-            <w:r>
-              <w:rPr>
-                <w:rFonts w:asciiTheme="minorHAnsi" w:eastAsiaTheme="minorEastAsia" w:hAnsiTheme="minorHAnsi"/>
-                <w:noProof/>
-                <w:spacing w:val="0"/>
-                <w:sz w:val="24"/>
-                <w:lang w:eastAsia="fr-FR"/>
-              </w:rPr>
-              <w:tab/>
-            </w:r>
-            <w:r>
-              <w:rPr>
-                <w:rStyle w:val="Lienhypertexte"/>
-                <w:noProof/>
-              </w:rPr>
-              <w:t>CA-13.2</w:t>
-            </w:r>
-            <w:r>
-              <w:rPr>
-                <w:noProof/>
-                <w:webHidden/>
-              </w:rPr>
-              <w:tab/>
-            </w:r>
-            <w:r>
-              <w:rPr>
-                <w:noProof/>
-                <w:webHidden/>
-              </w:rPr>
-              <w:fldChar w:fldCharType="begin"/>
-            </w:r>
-            <w:r>
-              <w:rPr>
-                <w:noProof/>
-                <w:webHidden/>
-              </w:rPr>
-              <w:instrText xml:space="preserve"> PAGEREF _Toc242695075 \h </w:instrText>
-            </w:r>
-            <w:r>
-              <w:rPr>
-                <w:noProof/>
-                <w:webHidden/>
-              </w:rPr>
-            </w:r>
-            <w:r>
-              <w:rPr>
-                <w:noProof/>
-                <w:webHidden/>
-              </w:rPr>
-              <w:fldChar w:fldCharType="separate"/>
-            </w:r>
-            <w:r>
-              <w:rPr>
-                <w:noProof/>
-                <w:webHidden/>
-              </w:rPr>
-              <w:t>5</w:t>
-            </w:r>
-            <w:r>
-              <w:rPr>
-                <w:noProof/>
-                <w:webHidden/>
-              </w:rPr>
-              <w:fldChar w:fldCharType="end"/>
-            </w:r>
-          </w:hyperlink>
-        </w:p>
-        <w:p>
-          <w:pPr>
-            <w:pStyle w:val="TM1"/>
-            <w:tabs>
-              <w:tab w:val="left" w:pos="480"/>
-              <w:tab w:val="right" w:leader="dot" w:pos="9062"/>
-            </w:tabs>
-            <w:rPr>
-              <w:rFonts w:asciiTheme="minorHAnsi" w:eastAsiaTheme="minorEastAsia" w:hAnsiTheme="minorHAnsi"/>
-              <w:noProof/>
-              <w:spacing w:val="0"/>
-              <w:sz w:val="24"/>
-              <w:lang w:eastAsia="fr-FR"/>
-            </w:rPr>
-          </w:pPr>
-          <w:hyperlink w:anchor="_Toc242695076" w:history="1">
-            <w:r>
-              <w:rPr>
-                <w:rStyle w:val="Lienhypertexte"/>
-                <w:noProof/>
-              </w:rPr>
-              <w:t>II.</w:t>
-            </w:r>
-            <w:r>
-              <w:rPr>
-                <w:rFonts w:asciiTheme="minorHAnsi" w:eastAsiaTheme="minorEastAsia" w:hAnsiTheme="minorHAnsi"/>
-                <w:noProof/>
-                <w:spacing w:val="0"/>
-                <w:sz w:val="24"/>
-                <w:lang w:eastAsia="fr-FR"/>
-              </w:rPr>
-              <w:tab/>
-            </w:r>
-            <w:r>
-              <w:rPr>
-                <w:rStyle w:val="Lienhypertexte"/>
-                <w:noProof/>
-              </w:rPr>
-              <w:t>Planning poker</w:t>
-            </w:r>
-            <w:r>
-              <w:rPr>
-                <w:noProof/>
-                <w:webHidden/>
-              </w:rPr>
-              <w:tab/>
-            </w:r>
-            <w:r>
-              <w:rPr>
-                <w:noProof/>
-                <w:webHidden/>
-              </w:rPr>
-              <w:fldChar w:fldCharType="begin"/>
-            </w:r>
-            <w:r>
-              <w:rPr>
-                <w:noProof/>
-                <w:webHidden/>
-              </w:rPr>
-              <w:instrText xml:space="preserve"> PAGEREF _Toc242695076 \h </w:instrText>
-            </w:r>
-            <w:r>
-              <w:rPr>
-                <w:noProof/>
-                <w:webHidden/>
-              </w:rPr>
-            </w:r>
-            <w:r>
-              <w:rPr>
-                <w:noProof/>
-                <w:webHidden/>
-              </w:rPr>
-              <w:fldChar w:fldCharType="separate"/>
-            </w:r>
-            <w:r>
-              <w:rPr>
-                <w:noProof/>
-                <w:webHidden/>
-              </w:rPr>
-              <w:t>5</w:t>
-            </w:r>
-            <w:r>
-              <w:rPr>
-                <w:noProof/>
-                <w:webHidden/>
-              </w:rPr>
-              <w:fldChar w:fldCharType="end"/>
-            </w:r>
-          </w:hyperlink>
-        </w:p>
-        <w:p>
-          <w:pPr>
-            <w:pStyle w:val="TM2"/>
-            <w:tabs>
-              <w:tab w:val="left" w:pos="960"/>
-              <w:tab w:val="right" w:leader="dot" w:pos="9062"/>
-            </w:tabs>
-            <w:rPr>
-              <w:rFonts w:asciiTheme="minorHAnsi" w:eastAsiaTheme="minorEastAsia" w:hAnsiTheme="minorHAnsi"/>
-              <w:noProof/>
-              <w:spacing w:val="0"/>
-              <w:sz w:val="24"/>
-              <w:lang w:eastAsia="fr-FR"/>
-            </w:rPr>
-          </w:pPr>
-          <w:hyperlink w:anchor="_Toc242695077" w:history="1">
-            <w:r>
-              <w:rPr>
-                <w:rStyle w:val="Lienhypertexte"/>
-                <w:noProof/>
-              </w:rPr>
-              <w:t>II. 1.</w:t>
-            </w:r>
-            <w:r>
-              <w:rPr>
-                <w:rFonts w:asciiTheme="minorHAnsi" w:eastAsiaTheme="minorEastAsia" w:hAnsiTheme="minorHAnsi"/>
-                <w:noProof/>
-                <w:spacing w:val="0"/>
-                <w:sz w:val="24"/>
-                <w:lang w:eastAsia="fr-FR"/>
-              </w:rPr>
-              <w:tab/>
-            </w:r>
-            <w:r>
-              <w:rPr>
-                <w:rStyle w:val="Lienhypertexte"/>
-                <w:noProof/>
-              </w:rPr>
-              <w:t>US-01</w:t>
-            </w:r>
-            <w:r>
-              <w:rPr>
-                <w:noProof/>
-                <w:webHidden/>
-              </w:rPr>
-              <w:tab/>
-            </w:r>
-            <w:r>
-              <w:rPr>
-                <w:noProof/>
-                <w:webHidden/>
-              </w:rPr>
-              <w:fldChar w:fldCharType="begin"/>
-            </w:r>
-            <w:r>
-              <w:rPr>
-                <w:noProof/>
-                <w:webHidden/>
-              </w:rPr>
-              <w:instrText xml:space="preserve"> PAGEREF _Toc242695077 \h </w:instrText>
-            </w:r>
-            <w:r>
-              <w:rPr>
-                <w:noProof/>
-                <w:webHidden/>
-              </w:rPr>
-            </w:r>
-            <w:r>
-              <w:rPr>
-                <w:noProof/>
-                <w:webHidden/>
-              </w:rPr>
-              <w:fldChar w:fldCharType="separate"/>
-            </w:r>
-            <w:r>
-              <w:rPr>
-                <w:noProof/>
-                <w:webHidden/>
-              </w:rPr>
-              <w:t>5</w:t>
-            </w:r>
-            <w:r>
-              <w:rPr>
-                <w:noProof/>
-                <w:webHidden/>
-              </w:rPr>
-              <w:fldChar w:fldCharType="end"/>
-            </w:r>
-          </w:hyperlink>
-        </w:p>
-        <w:p>
-          <w:pPr>
-            <w:pStyle w:val="TM2"/>
-            <w:tabs>
-              <w:tab w:val="left" w:pos="960"/>
-              <w:tab w:val="right" w:leader="dot" w:pos="9062"/>
-            </w:tabs>
-            <w:rPr>
-              <w:rFonts w:asciiTheme="minorHAnsi" w:eastAsiaTheme="minorEastAsia" w:hAnsiTheme="minorHAnsi"/>
-              <w:noProof/>
-              <w:spacing w:val="0"/>
-              <w:sz w:val="24"/>
-              <w:lang w:eastAsia="fr-FR"/>
-            </w:rPr>
-          </w:pPr>
-          <w:hyperlink w:anchor="_Toc242695078" w:history="1">
-            <w:r>
-              <w:rPr>
-                <w:rStyle w:val="Lienhypertexte"/>
-                <w:noProof/>
-              </w:rPr>
-              <w:t>II. 2.</w:t>
-            </w:r>
-            <w:r>
-              <w:rPr>
-                <w:rFonts w:asciiTheme="minorHAnsi" w:eastAsiaTheme="minorEastAsia" w:hAnsiTheme="minorHAnsi"/>
-                <w:noProof/>
-                <w:spacing w:val="0"/>
-                <w:sz w:val="24"/>
-                <w:lang w:eastAsia="fr-FR"/>
-              </w:rPr>
-              <w:tab/>
-            </w:r>
-            <w:r>
-              <w:rPr>
-                <w:rStyle w:val="Lienhypertexte"/>
-                <w:noProof/>
-              </w:rPr>
-              <w:t>US-02</w:t>
-            </w:r>
-            <w:r>
-              <w:rPr>
-                <w:noProof/>
-                <w:webHidden/>
-              </w:rPr>
-              <w:tab/>
-            </w:r>
-            <w:r>
-              <w:rPr>
-                <w:noProof/>
-                <w:webHidden/>
-              </w:rPr>
-              <w:fldChar w:fldCharType="begin"/>
-            </w:r>
-            <w:r>
-              <w:rPr>
-                <w:noProof/>
-                <w:webHidden/>
-              </w:rPr>
-              <w:instrText xml:space="preserve"> PAGEREF _Toc242695078 \h </w:instrText>
-            </w:r>
-            <w:r>
-              <w:rPr>
-                <w:noProof/>
-                <w:webHidden/>
-              </w:rPr>
-            </w:r>
-            <w:r>
-              <w:rPr>
-                <w:noProof/>
-                <w:webHidden/>
-              </w:rPr>
-              <w:fldChar w:fldCharType="separate"/>
-            </w:r>
-            <w:r>
-              <w:rPr>
-                <w:noProof/>
-                <w:webHidden/>
-              </w:rPr>
-              <w:t>5</w:t>
-            </w:r>
-            <w:r>
-              <w:rPr>
-                <w:noProof/>
-                <w:webHidden/>
-              </w:rPr>
-              <w:fldChar w:fldCharType="end"/>
-            </w:r>
-          </w:hyperlink>
-        </w:p>
-        <w:p>
-          <w:pPr>
-            <w:pStyle w:val="TM2"/>
-            <w:tabs>
-              <w:tab w:val="left" w:pos="960"/>
-              <w:tab w:val="right" w:leader="dot" w:pos="9062"/>
-            </w:tabs>
-            <w:rPr>
-              <w:rFonts w:asciiTheme="minorHAnsi" w:eastAsiaTheme="minorEastAsia" w:hAnsiTheme="minorHAnsi"/>
-              <w:noProof/>
-              <w:spacing w:val="0"/>
-              <w:sz w:val="24"/>
-              <w:lang w:eastAsia="fr-FR"/>
-            </w:rPr>
-          </w:pPr>
-          <w:hyperlink w:anchor="_Toc242695079" w:history="1">
-            <w:r>
-              <w:rPr>
-                <w:rStyle w:val="Lienhypertexte"/>
-                <w:noProof/>
-              </w:rPr>
-              <w:t>II. 3.</w:t>
-            </w:r>
-            <w:r>
-              <w:rPr>
-                <w:rFonts w:asciiTheme="minorHAnsi" w:eastAsiaTheme="minorEastAsia" w:hAnsiTheme="minorHAnsi"/>
-                <w:noProof/>
-                <w:spacing w:val="0"/>
-                <w:sz w:val="24"/>
-                <w:lang w:eastAsia="fr-FR"/>
-              </w:rPr>
-              <w:tab/>
-            </w:r>
-            <w:r>
-              <w:rPr>
-                <w:rStyle w:val="Lienhypertexte"/>
-                <w:noProof/>
-              </w:rPr>
-              <w:t>US-03</w:t>
-            </w:r>
-            <w:r>
-              <w:rPr>
-                <w:noProof/>
-                <w:webHidden/>
-              </w:rPr>
-              <w:tab/>
-            </w:r>
-            <w:r>
-              <w:rPr>
-                <w:noProof/>
-                <w:webHidden/>
-              </w:rPr>
-              <w:fldChar w:fldCharType="begin"/>
-            </w:r>
-            <w:r>
-              <w:rPr>
-                <w:noProof/>
-                <w:webHidden/>
-              </w:rPr>
-              <w:instrText xml:space="preserve"> PAGEREF _Toc242695079 \h </w:instrText>
-            </w:r>
-            <w:r>
-              <w:rPr>
-                <w:noProof/>
-                <w:webHidden/>
-              </w:rPr>
-            </w:r>
-            <w:r>
-              <w:rPr>
-                <w:noProof/>
-                <w:webHidden/>
-              </w:rPr>
-              <w:fldChar w:fldCharType="separate"/>
-            </w:r>
-            <w:r>
-              <w:rPr>
-                <w:noProof/>
-                <w:webHidden/>
-              </w:rPr>
-              <w:t>5</w:t>
-            </w:r>
-            <w:r>
-              <w:rPr>
-                <w:noProof/>
-                <w:webHidden/>
-              </w:rPr>
-              <w:fldChar w:fldCharType="end"/>
-            </w:r>
-          </w:hyperlink>
-        </w:p>
-        <w:p>
-          <w:pPr>
-            <w:pStyle w:val="TM2"/>
-            <w:tabs>
-              <w:tab w:val="left" w:pos="960"/>
-              <w:tab w:val="right" w:leader="dot" w:pos="9062"/>
-            </w:tabs>
-            <w:rPr>
-              <w:rFonts w:asciiTheme="minorHAnsi" w:eastAsiaTheme="minorEastAsia" w:hAnsiTheme="minorHAnsi"/>
-              <w:noProof/>
-              <w:spacing w:val="0"/>
-              <w:sz w:val="24"/>
-              <w:lang w:eastAsia="fr-FR"/>
-            </w:rPr>
-          </w:pPr>
-          <w:hyperlink w:anchor="_Toc242695080" w:history="1">
-            <w:r>
-              <w:rPr>
-                <w:rStyle w:val="Lienhypertexte"/>
-                <w:noProof/>
-              </w:rPr>
-              <w:t>II. 4.</w:t>
-            </w:r>
-            <w:r>
-              <w:rPr>
-                <w:rFonts w:asciiTheme="minorHAnsi" w:eastAsiaTheme="minorEastAsia" w:hAnsiTheme="minorHAnsi"/>
-                <w:noProof/>
-                <w:spacing w:val="0"/>
-                <w:sz w:val="24"/>
-                <w:lang w:eastAsia="fr-FR"/>
-              </w:rPr>
-              <w:tab/>
-            </w:r>
-            <w:r>
-              <w:rPr>
-                <w:rStyle w:val="Lienhypertexte"/>
-                <w:noProof/>
-              </w:rPr>
-              <w:t>US-05</w:t>
-            </w:r>
-            <w:r>
-              <w:rPr>
-                <w:noProof/>
-                <w:webHidden/>
-              </w:rPr>
-              <w:tab/>
-            </w:r>
-            <w:r>
-              <w:rPr>
-                <w:noProof/>
-                <w:webHidden/>
-              </w:rPr>
-              <w:fldChar w:fldCharType="begin"/>
-            </w:r>
-            <w:r>
-              <w:rPr>
-                <w:noProof/>
-                <w:webHidden/>
-              </w:rPr>
-              <w:instrText xml:space="preserve"> PAGEREF _Toc242695080 \h </w:instrText>
-            </w:r>
-            <w:r>
-              <w:rPr>
-                <w:noProof/>
-                <w:webHidden/>
-              </w:rPr>
-            </w:r>
-            <w:r>
-              <w:rPr>
-                <w:noProof/>
-                <w:webHidden/>
-              </w:rPr>
-              <w:fldChar w:fldCharType="separate"/>
-            </w:r>
-            <w:r>
-              <w:rPr>
-                <w:noProof/>
-                <w:webHidden/>
-              </w:rPr>
-              <w:t>5</w:t>
-            </w:r>
-            <w:r>
-              <w:rPr>
-                <w:noProof/>
-                <w:webHidden/>
-              </w:rPr>
-              <w:fldChar w:fldCharType="end"/>
-            </w:r>
-          </w:hyperlink>
-        </w:p>
-        <w:p>
-          <w:pPr>
-            <w:pStyle w:val="TM2"/>
-            <w:tabs>
-              <w:tab w:val="left" w:pos="960"/>
-              <w:tab w:val="right" w:leader="dot" w:pos="9062"/>
-            </w:tabs>
-            <w:rPr>
-              <w:rFonts w:asciiTheme="minorHAnsi" w:eastAsiaTheme="minorEastAsia" w:hAnsiTheme="minorHAnsi"/>
-              <w:noProof/>
-              <w:spacing w:val="0"/>
-              <w:sz w:val="24"/>
-              <w:lang w:eastAsia="fr-FR"/>
-            </w:rPr>
-          </w:pPr>
-          <w:hyperlink w:anchor="_Toc242695081" w:history="1">
-            <w:r>
-              <w:rPr>
-                <w:rStyle w:val="Lienhypertexte"/>
-                <w:noProof/>
-              </w:rPr>
-              <w:t>II. 5.</w:t>
-            </w:r>
-            <w:r>
-              <w:rPr>
-                <w:rFonts w:asciiTheme="minorHAnsi" w:eastAsiaTheme="minorEastAsia" w:hAnsiTheme="minorHAnsi"/>
-                <w:noProof/>
-                <w:spacing w:val="0"/>
-                <w:sz w:val="24"/>
-                <w:lang w:eastAsia="fr-FR"/>
-              </w:rPr>
-              <w:tab/>
-            </w:r>
-            <w:r>
-              <w:rPr>
-                <w:rStyle w:val="Lienhypertexte"/>
-                <w:noProof/>
-              </w:rPr>
-              <w:t>US-06</w:t>
-            </w:r>
-            <w:r>
-              <w:rPr>
-                <w:noProof/>
-                <w:webHidden/>
-              </w:rPr>
-              <w:tab/>
-            </w:r>
-            <w:r>
-              <w:rPr>
-                <w:noProof/>
-                <w:webHidden/>
-              </w:rPr>
-              <w:fldChar w:fldCharType="begin"/>
-            </w:r>
-            <w:r>
-              <w:rPr>
-                <w:noProof/>
-                <w:webHidden/>
-              </w:rPr>
-              <w:instrText xml:space="preserve"> PAGEREF _Toc242695081 \h </w:instrText>
-            </w:r>
-            <w:r>
-              <w:rPr>
-                <w:noProof/>
-                <w:webHidden/>
-              </w:rPr>
-            </w:r>
-            <w:r>
-              <w:rPr>
-                <w:noProof/>
-                <w:webHidden/>
-              </w:rPr>
-              <w:fldChar w:fldCharType="separate"/>
-            </w:r>
-            <w:r>
-              <w:rPr>
-                <w:noProof/>
-                <w:webHidden/>
-              </w:rPr>
-              <w:t>6</w:t>
-            </w:r>
-            <w:r>
-              <w:rPr>
-                <w:noProof/>
-                <w:webHidden/>
-              </w:rPr>
-              <w:fldChar w:fldCharType="end"/>
-            </w:r>
-          </w:hyperlink>
-        </w:p>
-        <w:p>
-          <w:pPr>
-            <w:pStyle w:val="TM2"/>
-            <w:tabs>
-              <w:tab w:val="left" w:pos="960"/>
-              <w:tab w:val="right" w:leader="dot" w:pos="9062"/>
-            </w:tabs>
-            <w:rPr>
-              <w:rFonts w:asciiTheme="minorHAnsi" w:eastAsiaTheme="minorEastAsia" w:hAnsiTheme="minorHAnsi"/>
-              <w:noProof/>
-              <w:spacing w:val="0"/>
-              <w:sz w:val="24"/>
-              <w:lang w:eastAsia="fr-FR"/>
-            </w:rPr>
-          </w:pPr>
-          <w:hyperlink w:anchor="_Toc242695082" w:history="1">
-            <w:r>
-              <w:rPr>
-                <w:rStyle w:val="Lienhypertexte"/>
-                <w:noProof/>
-              </w:rPr>
-              <w:t>II. 6.</w:t>
-            </w:r>
-            <w:r>
-              <w:rPr>
-                <w:rFonts w:asciiTheme="minorHAnsi" w:eastAsiaTheme="minorEastAsia" w:hAnsiTheme="minorHAnsi"/>
-                <w:noProof/>
-                <w:spacing w:val="0"/>
-                <w:sz w:val="24"/>
-                <w:lang w:eastAsia="fr-FR"/>
-              </w:rPr>
-              <w:tab/>
-            </w:r>
-            <w:r>
-              <w:rPr>
-                <w:rStyle w:val="Lienhypertexte"/>
-                <w:noProof/>
-              </w:rPr>
-              <w:t>US-07</w:t>
-            </w:r>
-            <w:r>
-              <w:rPr>
-                <w:noProof/>
-                <w:webHidden/>
-              </w:rPr>
-              <w:tab/>
-            </w:r>
-            <w:r>
-              <w:rPr>
-                <w:noProof/>
-                <w:webHidden/>
-              </w:rPr>
-              <w:fldChar w:fldCharType="begin"/>
-            </w:r>
-            <w:r>
-              <w:rPr>
-                <w:noProof/>
-                <w:webHidden/>
-              </w:rPr>
-              <w:instrText xml:space="preserve"> PAGEREF _Toc242695082 \h </w:instrText>
-            </w:r>
-            <w:r>
-              <w:rPr>
-                <w:noProof/>
-                <w:webHidden/>
-              </w:rPr>
-            </w:r>
-            <w:r>
-              <w:rPr>
-                <w:noProof/>
-                <w:webHidden/>
-              </w:rPr>
-              <w:fldChar w:fldCharType="separate"/>
-            </w:r>
-            <w:r>
-              <w:rPr>
-                <w:noProof/>
-                <w:webHidden/>
-              </w:rPr>
-              <w:t>6</w:t>
-            </w:r>
-            <w:r>
-              <w:rPr>
-                <w:noProof/>
-                <w:webHidden/>
-              </w:rPr>
-              <w:fldChar w:fldCharType="end"/>
-            </w:r>
-          </w:hyperlink>
-        </w:p>
-        <w:p>
-          <w:pPr>
-            <w:pStyle w:val="TM2"/>
-            <w:tabs>
-              <w:tab w:val="left" w:pos="960"/>
-              <w:tab w:val="right" w:leader="dot" w:pos="9062"/>
-            </w:tabs>
-            <w:rPr>
-              <w:rFonts w:asciiTheme="minorHAnsi" w:eastAsiaTheme="minorEastAsia" w:hAnsiTheme="minorHAnsi"/>
-              <w:noProof/>
-              <w:spacing w:val="0"/>
-              <w:sz w:val="24"/>
-              <w:lang w:eastAsia="fr-FR"/>
-            </w:rPr>
-          </w:pPr>
-          <w:hyperlink w:anchor="_Toc242695083" w:history="1">
-            <w:r>
-              <w:rPr>
-                <w:rStyle w:val="Lienhypertexte"/>
-                <w:noProof/>
-              </w:rPr>
-              <w:t>II. 7.</w:t>
-            </w:r>
-            <w:r>
-              <w:rPr>
-                <w:rFonts w:asciiTheme="minorHAnsi" w:eastAsiaTheme="minorEastAsia" w:hAnsiTheme="minorHAnsi"/>
-                <w:noProof/>
-                <w:spacing w:val="0"/>
-                <w:sz w:val="24"/>
-                <w:lang w:eastAsia="fr-FR"/>
-              </w:rPr>
-              <w:tab/>
-            </w:r>
-            <w:r>
-              <w:rPr>
-                <w:rStyle w:val="Lienhypertexte"/>
-                <w:noProof/>
-              </w:rPr>
-              <w:t>US-09</w:t>
-            </w:r>
-            <w:r>
-              <w:rPr>
-                <w:noProof/>
-                <w:webHidden/>
-              </w:rPr>
-              <w:tab/>
-            </w:r>
-            <w:r>
-              <w:rPr>
-                <w:noProof/>
-                <w:webHidden/>
-              </w:rPr>
-              <w:fldChar w:fldCharType="begin"/>
-            </w:r>
-            <w:r>
-              <w:rPr>
-                <w:noProof/>
-                <w:webHidden/>
-              </w:rPr>
-              <w:instrText xml:space="preserve"> PAGEREF _Toc242695083 \h </w:instrText>
-            </w:r>
-            <w:r>
-              <w:rPr>
-                <w:noProof/>
-                <w:webHidden/>
-              </w:rPr>
-            </w:r>
-            <w:r>
-              <w:rPr>
-                <w:noProof/>
-                <w:webHidden/>
-              </w:rPr>
-              <w:fldChar w:fldCharType="separate"/>
-            </w:r>
-            <w:r>
-              <w:rPr>
-                <w:noProof/>
-                <w:webHidden/>
-              </w:rPr>
-              <w:t>6</w:t>
-            </w:r>
-            <w:r>
-              <w:rPr>
-                <w:noProof/>
-                <w:webHidden/>
-              </w:rPr>
-              <w:fldChar w:fldCharType="end"/>
-            </w:r>
-          </w:hyperlink>
-        </w:p>
-        <w:p>
-          <w:pPr>
-            <w:pStyle w:val="TM2"/>
-            <w:tabs>
-              <w:tab w:val="left" w:pos="960"/>
-              <w:tab w:val="right" w:leader="dot" w:pos="9062"/>
-            </w:tabs>
-            <w:rPr>
-              <w:rFonts w:asciiTheme="minorHAnsi" w:eastAsiaTheme="minorEastAsia" w:hAnsiTheme="minorHAnsi"/>
-              <w:noProof/>
-              <w:spacing w:val="0"/>
-              <w:sz w:val="24"/>
-              <w:lang w:eastAsia="fr-FR"/>
-            </w:rPr>
-          </w:pPr>
-          <w:hyperlink w:anchor="_Toc242695084" w:history="1">
-            <w:r>
-              <w:rPr>
-                <w:rStyle w:val="Lienhypertexte"/>
-                <w:noProof/>
-              </w:rPr>
-              <w:t>II. 8.</w:t>
-            </w:r>
-            <w:r>
-              <w:rPr>
-                <w:rFonts w:asciiTheme="minorHAnsi" w:eastAsiaTheme="minorEastAsia" w:hAnsiTheme="minorHAnsi"/>
-                <w:noProof/>
-                <w:spacing w:val="0"/>
-                <w:sz w:val="24"/>
-                <w:lang w:eastAsia="fr-FR"/>
-              </w:rPr>
-              <w:tab/>
-            </w:r>
-            <w:r>
-              <w:rPr>
-                <w:rStyle w:val="Lienhypertexte"/>
-                <w:noProof/>
-              </w:rPr>
-              <w:t>US-10</w:t>
-            </w:r>
-            <w:r>
-              <w:rPr>
-                <w:noProof/>
-                <w:webHidden/>
-              </w:rPr>
-              <w:tab/>
-            </w:r>
-            <w:r>
-              <w:rPr>
-                <w:noProof/>
-                <w:webHidden/>
-              </w:rPr>
-              <w:fldChar w:fldCharType="begin"/>
-            </w:r>
-            <w:r>
-              <w:rPr>
-                <w:noProof/>
-                <w:webHidden/>
-              </w:rPr>
-              <w:instrText xml:space="preserve"> PAGEREF _Toc242695084 \h </w:instrText>
-            </w:r>
-            <w:r>
-              <w:rPr>
-                <w:noProof/>
-                <w:webHidden/>
-              </w:rPr>
-            </w:r>
-            <w:r>
-              <w:rPr>
-                <w:noProof/>
-                <w:webHidden/>
-              </w:rPr>
-              <w:fldChar w:fldCharType="separate"/>
-            </w:r>
-            <w:r>
-              <w:rPr>
-                <w:noProof/>
-                <w:webHidden/>
-              </w:rPr>
-              <w:t>6</w:t>
-            </w:r>
-            <w:r>
-              <w:rPr>
-                <w:noProof/>
-                <w:webHidden/>
-              </w:rPr>
-              <w:fldChar w:fldCharType="end"/>
-            </w:r>
-          </w:hyperlink>
-        </w:p>
-        <w:p>
-          <w:pPr>
-            <w:pStyle w:val="TM2"/>
-            <w:tabs>
-              <w:tab w:val="left" w:pos="960"/>
-              <w:tab w:val="right" w:leader="dot" w:pos="9062"/>
-            </w:tabs>
-            <w:rPr>
-              <w:rFonts w:asciiTheme="minorHAnsi" w:eastAsiaTheme="minorEastAsia" w:hAnsiTheme="minorHAnsi"/>
-              <w:noProof/>
-              <w:spacing w:val="0"/>
-              <w:sz w:val="24"/>
-              <w:lang w:eastAsia="fr-FR"/>
-            </w:rPr>
-          </w:pPr>
-          <w:hyperlink w:anchor="_Toc242695085" w:history="1">
-            <w:r>
-              <w:rPr>
-                <w:rStyle w:val="Lienhypertexte"/>
-                <w:noProof/>
-              </w:rPr>
-              <w:t>II. 9.</w:t>
-            </w:r>
-            <w:r>
-              <w:rPr>
-                <w:rFonts w:asciiTheme="minorHAnsi" w:eastAsiaTheme="minorEastAsia" w:hAnsiTheme="minorHAnsi"/>
-                <w:noProof/>
-                <w:spacing w:val="0"/>
-                <w:sz w:val="24"/>
-                <w:lang w:eastAsia="fr-FR"/>
-              </w:rPr>
-              <w:tab/>
-            </w:r>
-            <w:r>
-              <w:rPr>
-                <w:rStyle w:val="Lienhypertexte"/>
-                <w:noProof/>
-              </w:rPr>
-              <w:t>US-11</w:t>
-            </w:r>
-            <w:r>
-              <w:rPr>
-                <w:noProof/>
-                <w:webHidden/>
-              </w:rPr>
-              <w:tab/>
-            </w:r>
-            <w:r>
-              <w:rPr>
-                <w:noProof/>
-                <w:webHidden/>
-              </w:rPr>
-              <w:fldChar w:fldCharType="begin"/>
-            </w:r>
-            <w:r>
-              <w:rPr>
-                <w:noProof/>
-                <w:webHidden/>
-              </w:rPr>
-              <w:instrText xml:space="preserve"> PAGEREF _Toc242695085 \h </w:instrText>
-            </w:r>
-            <w:r>
-              <w:rPr>
-                <w:noProof/>
-                <w:webHidden/>
-              </w:rPr>
-            </w:r>
-            <w:r>
-              <w:rPr>
-                <w:noProof/>
-                <w:webHidden/>
-              </w:rPr>
-              <w:fldChar w:fldCharType="separate"/>
-            </w:r>
-            <w:r>
-              <w:rPr>
-                <w:noProof/>
-                <w:webHidden/>
-              </w:rPr>
-              <w:t>6</w:t>
-            </w:r>
-            <w:r>
-              <w:rPr>
-                <w:noProof/>
-                <w:webHidden/>
-              </w:rPr>
-              <w:fldChar w:fldCharType="end"/>
-            </w:r>
-          </w:hyperlink>
-        </w:p>
-        <w:p>
-          <w:pPr>
-            <w:pStyle w:val="TM2"/>
-            <w:tabs>
-              <w:tab w:val="left" w:pos="1200"/>
-              <w:tab w:val="right" w:leader="dot" w:pos="9062"/>
-            </w:tabs>
-            <w:rPr>
-              <w:rFonts w:asciiTheme="minorHAnsi" w:eastAsiaTheme="minorEastAsia" w:hAnsiTheme="minorHAnsi"/>
-              <w:noProof/>
-              <w:spacing w:val="0"/>
-              <w:sz w:val="24"/>
-              <w:lang w:eastAsia="fr-FR"/>
-            </w:rPr>
-          </w:pPr>
-          <w:hyperlink w:anchor="_Toc242695086" w:history="1">
-            <w:r>
-              <w:rPr>
-                <w:rStyle w:val="Lienhypertexte"/>
-                <w:noProof/>
-              </w:rPr>
-              <w:t>II. 10.</w:t>
-            </w:r>
-            <w:r>
-              <w:rPr>
-                <w:rFonts w:asciiTheme="minorHAnsi" w:eastAsiaTheme="minorEastAsia" w:hAnsiTheme="minorHAnsi"/>
-                <w:noProof/>
-                <w:spacing w:val="0"/>
-                <w:sz w:val="24"/>
-                <w:lang w:eastAsia="fr-FR"/>
-              </w:rPr>
-              <w:tab/>
-            </w:r>
-            <w:r>
-              <w:rPr>
-                <w:rStyle w:val="Lienhypertexte"/>
-                <w:noProof/>
-              </w:rPr>
-              <w:t>US-13</w:t>
-            </w:r>
-            <w:r>
-              <w:rPr>
-                <w:noProof/>
-                <w:webHidden/>
-              </w:rPr>
-              <w:tab/>
-            </w:r>
-            <w:r>
-              <w:rPr>
-                <w:noProof/>
-                <w:webHidden/>
-              </w:rPr>
-              <w:fldChar w:fldCharType="begin"/>
-            </w:r>
-            <w:r>
-              <w:rPr>
-                <w:noProof/>
-                <w:webHidden/>
-              </w:rPr>
-              <w:instrText xml:space="preserve"> PAGEREF _Toc242695086 \h </w:instrText>
-            </w:r>
-            <w:r>
-              <w:rPr>
-                <w:noProof/>
-                <w:webHidden/>
-              </w:rPr>
-            </w:r>
-            <w:r>
-              <w:rPr>
-                <w:noProof/>
-                <w:webHidden/>
-              </w:rPr>
-              <w:fldChar w:fldCharType="separate"/>
-            </w:r>
-            <w:r>
-              <w:rPr>
-                <w:noProof/>
-                <w:webHidden/>
-              </w:rPr>
-              <w:t>6</w:t>
-            </w:r>
-            <w:r>
-              <w:rPr>
-                <w:noProof/>
-                <w:webHidden/>
-              </w:rPr>
-              <w:fldChar w:fldCharType="end"/>
-            </w:r>
-          </w:hyperlink>
-        </w:p>
-        <w:p>
-          <w:pPr>
-            <w:pStyle w:val="TM2"/>
-            <w:tabs>
-              <w:tab w:val="left" w:pos="1200"/>
-              <w:tab w:val="right" w:leader="dot" w:pos="9062"/>
-            </w:tabs>
-            <w:rPr>
-              <w:rFonts w:asciiTheme="minorHAnsi" w:eastAsiaTheme="minorEastAsia" w:hAnsiTheme="minorHAnsi"/>
-              <w:noProof/>
-              <w:spacing w:val="0"/>
-              <w:sz w:val="24"/>
-              <w:lang w:eastAsia="fr-FR"/>
-            </w:rPr>
-          </w:pPr>
-          <w:hyperlink w:anchor="_Toc242695087" w:history="1">
-            <w:r>
-              <w:rPr>
-                <w:rStyle w:val="Lienhypertexte"/>
-                <w:noProof/>
-              </w:rPr>
-              <w:t>II. 11.</w:t>
-            </w:r>
-            <w:r>
-              <w:rPr>
-                <w:rFonts w:asciiTheme="minorHAnsi" w:eastAsiaTheme="minorEastAsia" w:hAnsiTheme="minorHAnsi"/>
-                <w:noProof/>
-                <w:spacing w:val="0"/>
-                <w:sz w:val="24"/>
-                <w:lang w:eastAsia="fr-FR"/>
-              </w:rPr>
-              <w:tab/>
-            </w:r>
-            <w:r>
-              <w:rPr>
-                <w:rStyle w:val="Lienhypertexte"/>
-                <w:noProof/>
-              </w:rPr>
-              <w:t>Retour réflexif</w:t>
-            </w:r>
-            <w:r>
-              <w:rPr>
-                <w:noProof/>
-                <w:webHidden/>
-              </w:rPr>
-              <w:tab/>
-            </w:r>
-            <w:r>
-              <w:rPr>
-                <w:noProof/>
-                <w:webHidden/>
-              </w:rPr>
-              <w:fldChar w:fldCharType="begin"/>
-            </w:r>
-            <w:r>
-              <w:rPr>
-                <w:noProof/>
-                <w:webHidden/>
-              </w:rPr>
-              <w:instrText xml:space="preserve"> PAGEREF _Toc242695087 \h </w:instrText>
-            </w:r>
-            <w:r>
-              <w:rPr>
-                <w:noProof/>
-                <w:webHidden/>
-              </w:rPr>
-            </w:r>
-            <w:r>
-              <w:rPr>
-                <w:noProof/>
-                <w:webHidden/>
-              </w:rPr>
-              <w:fldChar w:fldCharType="separate"/>
-            </w:r>
-            <w:r>
-              <w:rPr>
-                <w:noProof/>
-                <w:webHidden/>
-              </w:rPr>
-              <w:t>7</w:t>
-            </w:r>
-            <w:r>
-              <w:rPr>
-                <w:noProof/>
-                <w:webHidden/>
-              </w:rPr>
-              <w:fldChar w:fldCharType="end"/>
-            </w:r>
-          </w:hyperlink>
-        </w:p>
-        <w:p>
-          <w:pPr>
-            <w:pStyle w:val="TM1"/>
-            <w:tabs>
-              <w:tab w:val="left" w:pos="720"/>
-              <w:tab w:val="right" w:leader="dot" w:pos="9062"/>
-            </w:tabs>
-            <w:rPr>
-              <w:rFonts w:asciiTheme="minorHAnsi" w:eastAsiaTheme="minorEastAsia" w:hAnsiTheme="minorHAnsi"/>
-              <w:noProof/>
-              <w:spacing w:val="0"/>
-              <w:sz w:val="24"/>
-              <w:lang w:eastAsia="fr-FR"/>
-            </w:rPr>
-          </w:pPr>
-          <w:hyperlink w:anchor="_Toc242695088" w:history="1">
-            <w:r>
-              <w:rPr>
-                <w:rStyle w:val="Lienhypertexte"/>
-                <w:noProof/>
-              </w:rPr>
-              <w:t>III.</w:t>
-            </w:r>
-            <w:r>
-              <w:rPr>
-                <w:rFonts w:asciiTheme="minorHAnsi" w:eastAsiaTheme="minorEastAsia" w:hAnsiTheme="minorHAnsi"/>
-                <w:noProof/>
-                <w:spacing w:val="0"/>
-                <w:sz w:val="24"/>
-                <w:lang w:eastAsia="fr-FR"/>
-              </w:rPr>
-              <w:tab/>
-            </w:r>
-            <w:r>
-              <w:rPr>
-                <w:rStyle w:val="Lienhypertexte"/>
-                <w:noProof/>
-              </w:rPr>
-              <w:t>Definition of Done</w:t>
-            </w:r>
-            <w:r>
-              <w:rPr>
-                <w:noProof/>
-                <w:webHidden/>
-              </w:rPr>
-              <w:tab/>
-            </w:r>
-            <w:r>
-              <w:rPr>
-                <w:noProof/>
-                <w:webHidden/>
-              </w:rPr>
-              <w:fldChar w:fldCharType="begin"/>
-            </w:r>
-            <w:r>
-              <w:rPr>
-                <w:noProof/>
-                <w:webHidden/>
-              </w:rPr>
-              <w:instrText xml:space="preserve"> PAGEREF _Toc242695088 \h </w:instrText>
-            </w:r>
-            <w:r>
-              <w:rPr>
-                <w:noProof/>
-                <w:webHidden/>
-              </w:rPr>
-            </w:r>
-            <w:r>
-              <w:rPr>
-                <w:noProof/>
-                <w:webHidden/>
-              </w:rPr>
-              <w:fldChar w:fldCharType="separate"/>
-            </w:r>
-            <w:r>
-              <w:rPr>
-                <w:noProof/>
-                <w:webHidden/>
-              </w:rPr>
-              <w:t>7</w:t>
-            </w:r>
-            <w:r>
-              <w:rPr>
-                <w:noProof/>
-                <w:webHidden/>
-              </w:rPr>
-              <w:fldChar w:fldCharType="end"/>
-            </w:r>
-          </w:hyperlink>
-        </w:p>
-        <w:p>
-          <w:pPr>
-            <w:pStyle w:val="TM1"/>
-            <w:tabs>
-              <w:tab w:val="right" w:leader="dot" w:pos="9062"/>
-            </w:tabs>
-            <w:rPr>
-              <w:rFonts w:asciiTheme="minorHAnsi" w:eastAsiaTheme="minorEastAsia" w:hAnsiTheme="minorHAnsi"/>
-              <w:noProof/>
-              <w:spacing w:val="0"/>
-              <w:sz w:val="24"/>
-              <w:lang w:eastAsia="fr-FR"/>
-            </w:rPr>
-          </w:pPr>
-          <w:hyperlink w:anchor="_Toc242695089" w:history="1">
-            <w:r>
-              <w:rPr>
-                <w:rStyle w:val="Lienhypertexte"/>
-                <w:noProof/>
-              </w:rPr>
-              <w:t>Backlog Estime (Sprint 1)</w:t>
-            </w:r>
-            <w:r>
-              <w:rPr>
-                <w:noProof/>
-                <w:webHidden/>
-              </w:rPr>
-              <w:tab/>
-            </w:r>
-            <w:r>
-              <w:rPr>
-                <w:noProof/>
-                <w:webHidden/>
-              </w:rPr>
-              <w:fldChar w:fldCharType="begin"/>
-            </w:r>
-            <w:r>
-              <w:rPr>
-                <w:noProof/>
-                <w:webHidden/>
-              </w:rPr>
-              <w:instrText xml:space="preserve"> PAGEREF _Toc242695089 \h </w:instrText>
-            </w:r>
-            <w:r>
-              <w:rPr>
-                <w:noProof/>
-                <w:webHidden/>
-              </w:rPr>
-            </w:r>
-            <w:r>
-              <w:rPr>
-                <w:noProof/>
-                <w:webHidden/>
-              </w:rPr>
-              <w:fldChar w:fldCharType="separate"/>
-            </w:r>
-            <w:r>
-              <w:rPr>
-                <w:noProof/>
-                <w:webHidden/>
-              </w:rPr>
-              <w:t>9</w:t>
-            </w:r>
-            <w:r>
-              <w:rPr>
-                <w:noProof/>
-                <w:webHidden/>
-              </w:rPr>
-              <w:fldChar w:fldCharType="end"/>
-            </w:r>
-          </w:hyperlink>
-        </w:p>
-        <w:p>
-          <w:pPr>
-            <w:pStyle w:val="TM1"/>
-            <w:tabs>
-              <w:tab w:val="left" w:pos="720"/>
-              <w:tab w:val="right" w:leader="dot" w:pos="9062"/>
-            </w:tabs>
-            <w:rPr>
-              <w:rFonts w:asciiTheme="minorHAnsi" w:eastAsiaTheme="minorEastAsia" w:hAnsiTheme="minorHAnsi"/>
-              <w:noProof/>
-              <w:spacing w:val="0"/>
-              <w:sz w:val="24"/>
-              <w:lang w:eastAsia="fr-FR"/>
-            </w:rPr>
-          </w:pPr>
-          <w:hyperlink w:anchor="_Toc242695090" w:history="1">
-            <w:r>
-              <w:rPr>
-                <w:rStyle w:val="Lienhypertexte"/>
-                <w:noProof/>
-              </w:rPr>
-              <w:t>IV.</w:t>
-            </w:r>
-            <w:r>
-              <w:rPr>
-                <w:rFonts w:asciiTheme="minorHAnsi" w:eastAsiaTheme="minorEastAsia" w:hAnsiTheme="minorHAnsi"/>
-                <w:noProof/>
-                <w:spacing w:val="0"/>
-                <w:sz w:val="24"/>
-                <w:lang w:eastAsia="fr-FR"/>
-              </w:rPr>
-              <w:tab/>
-            </w:r>
-            <w:r>
-              <w:rPr>
-                <w:rStyle w:val="Lienhypertexte"/>
-                <w:noProof/>
-              </w:rPr>
-              <w:t>Lien du commit de fin de sprint</w:t>
-            </w:r>
-            <w:r>
-              <w:rPr>
-                <w:noProof/>
-                <w:webHidden/>
-              </w:rPr>
-              <w:tab/>
-            </w:r>
-            <w:r>
-              <w:rPr>
-                <w:noProof/>
-                <w:webHidden/>
-              </w:rPr>
-              <w:fldChar w:fldCharType="begin"/>
-            </w:r>
-            <w:r>
-              <w:rPr>
-                <w:noProof/>
-                <w:webHidden/>
-              </w:rPr>
-              <w:instrText xml:space="preserve"> PAGEREF _Toc242695090 \h </w:instrText>
-            </w:r>
-            <w:r>
-              <w:rPr>
-                <w:noProof/>
-                <w:webHidden/>
-              </w:rPr>
-            </w:r>
-            <w:r>
-              <w:rPr>
-                <w:noProof/>
-                <w:webHidden/>
-              </w:rPr>
-              <w:fldChar w:fldCharType="separate"/>
-            </w:r>
-            <w:r>
-              <w:rPr>
-                <w:noProof/>
-                <w:webHidden/>
-              </w:rPr>
-              <w:t>9</w:t>
             </w:r>
             <w:r>
               <w:rPr>
@@ -4308,12 +906,17 @@
       <w:pPr>
         <w:pStyle w:val="Titre1"/>
       </w:pPr>
+      <w:bookmarkStart w:id="0" w:name="_Toc242870898"/>
       <w:r>
         <w:lastRenderedPageBreak/>
         <w:t>T</w:t>
       </w:r>
       <w:r>
-        <w:t xml:space="preserve">able de décision </w:t>
+        <w:t>able de décision</w:t>
+      </w:r>
+      <w:bookmarkEnd w:id="0"/>
+      <w:r>
+        <w:t xml:space="preserve"> </w:t>
       </w:r>
       <w:r>
         <w:t xml:space="preserve"> </w:t>
@@ -4668,9 +1271,16 @@
             <w:tcW w:w="1874" w:type="dxa"/>
           </w:tcPr>
           <w:p>
-            <w:r>
-              <w:t>Café,Café,Café</w:t>
-            </w:r>
+            <w:proofErr w:type="spellStart"/>
+            <w:proofErr w:type="gramStart"/>
+            <w:r>
+              <w:t>Café,Café</w:t>
+            </w:r>
+            <w:proofErr w:type="gramEnd"/>
+            <w:r>
+              <w:t>,Café</w:t>
+            </w:r>
+            <w:proofErr w:type="spellEnd"/>
           </w:p>
         </w:tc>
         <w:tc>
@@ -4830,8 +1440,13 @@
             <w:tcW w:w="1874" w:type="dxa"/>
           </w:tcPr>
           <w:p>
-            <w:r>
-              <w:t>?, 5,8</w:t>
+            <w:proofErr w:type="gramStart"/>
+            <w:r>
+              <w:t>?,</w:t>
+            </w:r>
+            <w:proofErr w:type="gramEnd"/>
+            <w:r>
+              <w:t xml:space="preserve"> 5,8</w:t>
             </w:r>
           </w:p>
         </w:tc>
@@ -4841,7 +1456,15 @@
           </w:tcPr>
           <w:p>
             <w:r>
-              <w:t>Revote ( ?)</w:t>
+              <w:t xml:space="preserve">Revote </w:t>
+            </w:r>
+            <w:proofErr w:type="gramStart"/>
+            <w:r>
+              <w:t>( ?</w:t>
+            </w:r>
+            <w:proofErr w:type="gramEnd"/>
+            <w:r>
+              <w:t>)</w:t>
             </w:r>
           </w:p>
         </w:tc>
@@ -4981,8 +1604,13 @@
           </w:tcPr>
           <w:p>
             <w:r>
-              <w:t>5,5,Café</w:t>
-            </w:r>
+              <w:t>5,</w:t>
+            </w:r>
+            <w:proofErr w:type="gramStart"/>
+            <w:r>
+              <w:t>5,Café</w:t>
+            </w:r>
+            <w:proofErr w:type="gramEnd"/>
           </w:p>
         </w:tc>
         <w:tc>
@@ -5069,7 +1697,15 @@
         <w:t> : S’il y a</w:t>
       </w:r>
       <w:r>
-        <w:t xml:space="preserve"> un nombre pair de vote avec une règle médiane au lieu de faire la moyenne des valeurs centrales. Ont prend la plus grande des valeurs centrales par principe de précaution pour ne pas risquer de sous évaluer une tache.</w:t>
+        <w:t xml:space="preserve"> un nombre pair de vote avec une règle médiane au lieu de faire la moyenne des valeurs centrales. </w:t>
+      </w:r>
+      <w:proofErr w:type="spellStart"/>
+      <w:r>
+        <w:t>Ont</w:t>
+      </w:r>
+      <w:proofErr w:type="spellEnd"/>
+      <w:r>
+        <w:t xml:space="preserve"> prend la plus grande des valeurs centrales par principe de précaution pour ne pas risquer de sous évaluer une tache.</w:t>
       </w:r>
       <w:r>
         <w:br/>
@@ -5077,22 +1713,94 @@
     </w:p>
     <w:p>
       <w:pPr>
-        <w:pStyle w:val="Titre5"/>
+        <w:jc w:val="left"/>
       </w:pPr>
       <w:r>
-        <w:t>Pour le code :</w:t>
+        <w:br w:type="page"/>
       </w:r>
     </w:p>
     <w:p>
+      <w:pPr>
+        <w:pStyle w:val="Titre1"/>
+      </w:pPr>
+      <w:bookmarkStart w:id="1" w:name="_Toc242870899"/>
       <w:r>
-        <w:t xml:space="preserve">Il faut ajouter une classe qui manipule le GameSession ou un attribut de cette dernière nommé RuleEngine (du domain) qui servira a renvoyer la valeur et le résultat du vote en fonction de la game session. A voir ou placer cette classe niveau architecture dans le projet. Les test devront utiliser cette classe à la fin. </w:t>
+        <w:lastRenderedPageBreak/>
+        <w:t xml:space="preserve">Liste des </w:t>
       </w:r>
+      <w:proofErr w:type="spellStart"/>
+      <w:r>
+        <w:t>commits</w:t>
+      </w:r>
+      <w:bookmarkEnd w:id="1"/>
+      <w:proofErr w:type="spellEnd"/>
     </w:p>
+    <w:p>
+      <w:pPr>
+        <w:pStyle w:val="Titre2"/>
+      </w:pPr>
+      <w:bookmarkStart w:id="2" w:name="_Toc242870900"/>
+      <w:r>
+        <w:t>Rouge</w:t>
+      </w:r>
+      <w:bookmarkEnd w:id="2"/>
+    </w:p>
+    <w:p>
+      <w:hyperlink r:id="rId9" w:history="1">
+        <w:r>
+          <w:rPr>
+            <w:rStyle w:val="Lienhypertexte"/>
+          </w:rPr>
+          <w:t>https://github.com/Corentin-Legrand/41LIDA01_B5_CAPI/commit/7e9aa0d033b407ec0f9b0b444fb53e7445029bca</w:t>
+        </w:r>
+      </w:hyperlink>
+    </w:p>
+    <w:p>
+      <w:pPr>
+        <w:pStyle w:val="Titre2"/>
+      </w:pPr>
+      <w:bookmarkStart w:id="3" w:name="_Toc242870901"/>
+      <w:r>
+        <w:t>Vert</w:t>
+      </w:r>
+      <w:bookmarkEnd w:id="3"/>
+    </w:p>
+    <w:p>
+      <w:hyperlink r:id="rId10" w:history="1">
+        <w:r>
+          <w:rPr>
+            <w:rStyle w:val="Lienhypertexte"/>
+          </w:rPr>
+          <w:t>https://github.com/Corentin-Legrand/41LIDA01_B5_CAPI/commit/87b4c8a00e11dc7b66ec27b18844c8cbc219bbb3</w:t>
+        </w:r>
+      </w:hyperlink>
+    </w:p>
+    <w:p>
+      <w:pPr>
+        <w:pStyle w:val="Titre2"/>
+      </w:pPr>
+      <w:bookmarkStart w:id="4" w:name="_Toc242870902"/>
+      <w:r>
+        <w:t>Lien vers la PR</w:t>
+      </w:r>
+      <w:bookmarkEnd w:id="4"/>
+    </w:p>
+    <w:p>
+      <w:hyperlink r:id="rId11" w:history="1">
+        <w:r>
+          <w:rPr>
+            <w:rStyle w:val="Lienhypertexte"/>
+          </w:rPr>
+          <w:t>https://github.com/Corentin-Legrand/41LIDA01_B5_CAPI/pull/15</w:t>
+        </w:r>
+      </w:hyperlink>
+    </w:p>
+    <w:p/>
     <w:sectPr>
-      <w:headerReference w:type="default" r:id="rId9"/>
-      <w:footerReference w:type="default" r:id="rId10"/>
-      <w:headerReference w:type="first" r:id="rId11"/>
-      <w:footerReference w:type="first" r:id="rId12"/>
+      <w:headerReference w:type="default" r:id="rId12"/>
+      <w:footerReference w:type="default" r:id="rId13"/>
+      <w:headerReference w:type="first" r:id="rId14"/>
+      <w:footerReference w:type="first" r:id="rId15"/>
       <w:pgSz w:w="11906" w:h="16838"/>
       <w:pgMar w:top="1417" w:right="1417" w:bottom="1417" w:left="1417" w:header="708" w:footer="708" w:gutter="0"/>
       <w:pgNumType w:start="0"/>
@@ -9010,7 +5718,7 @@
           </w:pPr>
           <w:r>
             <w:rPr>
-              <w:color w:val="2F5496" w:themeColor="accent1" w:themeShade="BF"/>
+              <w:color w:val="0F4761" w:themeColor="accent1" w:themeShade="BF"/>
             </w:rPr>
             <w:t>[Nom de la société]</w:t>
           </w:r>
@@ -9040,7 +5748,7 @@
           <w:r>
             <w:rPr>
               <w:rFonts w:asciiTheme="majorHAnsi" w:eastAsiaTheme="majorEastAsia" w:hAnsiTheme="majorHAnsi" w:cstheme="majorBidi"/>
-              <w:color w:val="4472C4" w:themeColor="accent1"/>
+              <w:color w:val="156082" w:themeColor="accent1"/>
               <w:sz w:val="88"/>
               <w:szCs w:val="88"/>
             </w:rPr>
@@ -9071,7 +5779,7 @@
           </w:pPr>
           <w:r>
             <w:rPr>
-              <w:color w:val="2F5496" w:themeColor="accent1" w:themeShade="BF"/>
+              <w:color w:val="0F4761" w:themeColor="accent1" w:themeShade="BF"/>
             </w:rPr>
             <w:t>[Sous-titre du document]</w:t>
           </w:r>
@@ -9100,7 +5808,7 @@
           </w:pPr>
           <w:r>
             <w:rPr>
-              <w:color w:val="4472C4" w:themeColor="accent1"/>
+              <w:color w:val="156082" w:themeColor="accent1"/>
               <w:sz w:val="28"/>
               <w:szCs w:val="28"/>
             </w:rPr>
@@ -9131,7 +5839,7 @@
           </w:pPr>
           <w:r>
             <w:rPr>
-              <w:color w:val="4472C4" w:themeColor="accent1"/>
+              <w:color w:val="156082" w:themeColor="accent1"/>
               <w:sz w:val="28"/>
               <w:szCs w:val="28"/>
             </w:rPr>
@@ -9182,7 +5890,7 @@
   </w:font>
   <w:font w:name="Sofia Pro">
     <w:altName w:val="Calibri"/>
-    <w:panose1 w:val="00000000000000000000"/>
+    <w:panose1 w:val="02000000000000000000"/>
     <w:charset w:val="00"/>
     <w:family w:val="swiss"/>
     <w:notTrueType/>
@@ -9191,6 +5899,7 @@
   </w:font>
   <w:font w:name="TT Neoris Trial">
     <w:altName w:val="Calibri"/>
+    <w:panose1 w:val="020B0003030000020004"/>
     <w:charset w:val="00"/>
     <w:family w:val="swiss"/>
     <w:pitch w:val="variable"/>
@@ -9204,6 +5913,7 @@
   </w:font>
   <w:font w:name="OCR-A BT">
     <w:altName w:val="Calibri"/>
+    <w:panose1 w:val="020F0501020204020304"/>
     <w:charset w:val="00"/>
     <w:family w:val="swiss"/>
     <w:pitch w:val="variable"/>
@@ -9222,13 +5932,6 @@
     <w:family w:val="modern"/>
     <w:pitch w:val="fixed"/>
     <w:sig w:usb0="8000028F" w:usb1="00001800" w:usb2="00000000" w:usb3="00000000" w:csb0="0000001F" w:csb1="00000000"/>
-  </w:font>
-  <w:font w:name="Calibri Light">
-    <w:panose1 w:val="020F0302020204030204"/>
-    <w:charset w:val="00"/>
-    <w:family w:val="swiss"/>
-    <w:pitch w:val="variable"/>
-    <w:sig w:usb0="E4002EFF" w:usb1="C200247B" w:usb2="00000009" w:usb3="00000000" w:csb0="000001FF" w:csb1="00000000"/>
   </w:font>
 </w:fonts>
 </file>
@@ -9272,7 +5975,9 @@
     <w:rsid w:val="00A027E6"/>
     <w:rsid w:val="00AE0233"/>
     <w:rsid w:val="00B021F1"/>
+    <w:rsid w:val="00BB3AD8"/>
     <w:rsid w:val="00E4678A"/>
+    <w:rsid w:val="00E46BA3"/>
     <w:rsid w:val="00E71964"/>
     <w:rsid w:val="00F05FE5"/>
     <w:rsid w:val="00FF69E9"/>

</xml_diff>

<commit_message>
docs(R2): corriger le rendu de la séance 2 :
- Lien « vert » remplacé par le lien du run vert de la CI (au lieu d'un commit)
- Ajout du lien du run rouge (8 tests en échec)
- Partie « Liste des commits » renommée en « Liens », sous-titres explicites
- Précision : la PR #15 contient la revue et l'approbation du copilote
- « Précisions » renommées en « Décisions inventées », numérotées D-01 à D-04
- Ajout de D-04 : aucun vote reçu, donc revote
- Correction de l'orthographe et de la numérotation des pages
</commit_message>
<xml_diff>
--- a/docs/rendus/Séance 2.docx
+++ b/docs/rendus/Séance 2.docx
@@ -100,34 +100,7 @@
                         <w:sz w:val="32"/>
                         <w:szCs w:val="32"/>
                       </w:rPr>
-                      <w:t>e universitaire 202</w:t>
-                    </w:r>
-                    <w:r>
-                      <w:rPr>
-                        <w:rFonts w:ascii="TT Neoris Trial" w:hAnsi="TT Neoris Trial"/>
-                        <w:color w:val="3A7C22" w:themeColor="accent6" w:themeShade="BF"/>
-                        <w:sz w:val="32"/>
-                        <w:szCs w:val="32"/>
-                      </w:rPr>
-                      <w:t>6</w:t>
-                    </w:r>
-                    <w:r>
-                      <w:rPr>
-                        <w:rFonts w:ascii="TT Neoris Trial" w:hAnsi="TT Neoris Trial"/>
-                        <w:color w:val="3A7C22" w:themeColor="accent6" w:themeShade="BF"/>
-                        <w:sz w:val="32"/>
-                        <w:szCs w:val="32"/>
-                      </w:rPr>
-                      <w:t>-202</w:t>
-                    </w:r>
-                    <w:r>
-                      <w:rPr>
-                        <w:rFonts w:ascii="TT Neoris Trial" w:hAnsi="TT Neoris Trial"/>
-                        <w:color w:val="3A7C22" w:themeColor="accent6" w:themeShade="BF"/>
-                        <w:sz w:val="32"/>
-                        <w:szCs w:val="32"/>
-                      </w:rPr>
-                      <w:t>7</w:t>
+                      <w:t>e universitaire 2026-2027</w:t>
                     </w:r>
                   </w:p>
                 </w:tc>
@@ -182,16 +155,7 @@
                         <w:sz w:val="88"/>
                         <w:szCs w:val="88"/>
                       </w:rPr>
-                      <w:t xml:space="preserve">SEANCE </w:t>
-                    </w:r>
-                    <w:r>
-                      <w:rPr>
-                        <w:rFonts w:ascii="TT Neoris Trial" w:eastAsiaTheme="majorEastAsia" w:hAnsi="TT Neoris Trial" w:cstheme="majorBidi"/>
-                        <w:color w:val="3A7C22" w:themeColor="accent6" w:themeShade="BF"/>
-                        <w:sz w:val="88"/>
-                        <w:szCs w:val="88"/>
-                      </w:rPr>
-                      <w:t>2</w:t>
+                      <w:t xml:space="preserve">SEANCE 2</w:t>
                     </w:r>
                   </w:p>
                 </w:sdtContent>
@@ -441,11 +405,7 @@
           </w:pPr>
           <w:r>
             <w:fldChar w:fldCharType="begin"/>
-          </w:r>
-          <w:r>
             <w:instrText xml:space="preserve"> TOC \o "1-3" \h \z \u </w:instrText>
-          </w:r>
-          <w:r>
             <w:fldChar w:fldCharType="separate"/>
           </w:r>
           <w:hyperlink w:anchor="_Toc242870898" w:history="1">
@@ -479,46 +439,10 @@
                 <w:webHidden/>
               </w:rPr>
               <w:tab/>
-            </w:r>
-            <w:r>
-              <w:rPr>
-                <w:noProof/>
-                <w:webHidden/>
-              </w:rPr>
               <w:fldChar w:fldCharType="begin"/>
-            </w:r>
-            <w:r>
-              <w:rPr>
-                <w:noProof/>
-                <w:webHidden/>
-              </w:rPr>
               <w:instrText xml:space="preserve"> PAGEREF _Toc242870898 \h </w:instrText>
-            </w:r>
-            <w:r>
-              <w:rPr>
-                <w:noProof/>
-                <w:webHidden/>
-              </w:rPr>
-            </w:r>
-            <w:r>
-              <w:rPr>
-                <w:noProof/>
-                <w:webHidden/>
-              </w:rPr>
               <w:fldChar w:fldCharType="separate"/>
-            </w:r>
-            <w:r>
-              <w:rPr>
-                <w:noProof/>
-                <w:webHidden/>
-              </w:rPr>
-              <w:t>2</w:t>
-            </w:r>
-            <w:r>
-              <w:rPr>
-                <w:noProof/>
-                <w:webHidden/>
-              </w:rPr>
+              <w:t>3</w:t>
               <w:fldChar w:fldCharType="end"/>
             </w:r>
           </w:hyperlink>
@@ -561,7 +485,7 @@
                 <w:rStyle w:val="Lienhypertexte"/>
                 <w:noProof/>
               </w:rPr>
-              <w:t>Liste des commits</w:t>
+              <w:t>Liens</w:t>
             </w:r>
             <w:r>
               <w:rPr>
@@ -569,46 +493,10 @@
                 <w:webHidden/>
               </w:rPr>
               <w:tab/>
-            </w:r>
-            <w:r>
-              <w:rPr>
-                <w:noProof/>
-                <w:webHidden/>
-              </w:rPr>
               <w:fldChar w:fldCharType="begin"/>
-            </w:r>
-            <w:r>
-              <w:rPr>
-                <w:noProof/>
-                <w:webHidden/>
-              </w:rPr>
               <w:instrText xml:space="preserve"> PAGEREF _Toc242870899 \h </w:instrText>
-            </w:r>
-            <w:r>
-              <w:rPr>
-                <w:noProof/>
-                <w:webHidden/>
-              </w:rPr>
-            </w:r>
-            <w:r>
-              <w:rPr>
-                <w:noProof/>
-                <w:webHidden/>
-              </w:rPr>
               <w:fldChar w:fldCharType="separate"/>
-            </w:r>
-            <w:r>
-              <w:rPr>
-                <w:noProof/>
-                <w:webHidden/>
-              </w:rPr>
-              <w:t>3</w:t>
-            </w:r>
-            <w:r>
-              <w:rPr>
-                <w:noProof/>
-                <w:webHidden/>
-              </w:rPr>
+              <w:t>4</w:t>
               <w:fldChar w:fldCharType="end"/>
             </w:r>
           </w:hyperlink>
@@ -651,7 +539,7 @@
                 <w:rStyle w:val="Lienhypertexte"/>
                 <w:noProof/>
               </w:rPr>
-              <w:t>Rouge</w:t>
+              <w:t>Commit rouge (tests seuls)</w:t>
             </w:r>
             <w:r>
               <w:rPr>
@@ -659,46 +547,10 @@
                 <w:webHidden/>
               </w:rPr>
               <w:tab/>
-            </w:r>
-            <w:r>
-              <w:rPr>
-                <w:noProof/>
-                <w:webHidden/>
-              </w:rPr>
               <w:fldChar w:fldCharType="begin"/>
-            </w:r>
-            <w:r>
-              <w:rPr>
-                <w:noProof/>
-                <w:webHidden/>
-              </w:rPr>
               <w:instrText xml:space="preserve"> PAGEREF _Toc242870900 \h </w:instrText>
-            </w:r>
-            <w:r>
-              <w:rPr>
-                <w:noProof/>
-                <w:webHidden/>
-              </w:rPr>
-            </w:r>
-            <w:r>
-              <w:rPr>
-                <w:noProof/>
-                <w:webHidden/>
-              </w:rPr>
               <w:fldChar w:fldCharType="separate"/>
-            </w:r>
-            <w:r>
-              <w:rPr>
-                <w:noProof/>
-                <w:webHidden/>
-              </w:rPr>
-              <w:t>3</w:t>
-            </w:r>
-            <w:r>
-              <w:rPr>
-                <w:noProof/>
-                <w:webHidden/>
-              </w:rPr>
+              <w:t>4</w:t>
               <w:fldChar w:fldCharType="end"/>
             </w:r>
           </w:hyperlink>
@@ -741,7 +593,7 @@
                 <w:rStyle w:val="Lienhypertexte"/>
                 <w:noProof/>
               </w:rPr>
-              <w:t>Vert</w:t>
+              <w:t>Run vert de la CI</w:t>
             </w:r>
             <w:r>
               <w:rPr>
@@ -749,46 +601,10 @@
                 <w:webHidden/>
               </w:rPr>
               <w:tab/>
-            </w:r>
-            <w:r>
-              <w:rPr>
-                <w:noProof/>
-                <w:webHidden/>
-              </w:rPr>
               <w:fldChar w:fldCharType="begin"/>
-            </w:r>
-            <w:r>
-              <w:rPr>
-                <w:noProof/>
-                <w:webHidden/>
-              </w:rPr>
               <w:instrText xml:space="preserve"> PAGEREF _Toc242870901 \h </w:instrText>
-            </w:r>
-            <w:r>
-              <w:rPr>
-                <w:noProof/>
-                <w:webHidden/>
-              </w:rPr>
-            </w:r>
-            <w:r>
-              <w:rPr>
-                <w:noProof/>
-                <w:webHidden/>
-              </w:rPr>
               <w:fldChar w:fldCharType="separate"/>
-            </w:r>
-            <w:r>
-              <w:rPr>
-                <w:noProof/>
-                <w:webHidden/>
-              </w:rPr>
-              <w:t>3</w:t>
-            </w:r>
-            <w:r>
-              <w:rPr>
-                <w:noProof/>
-                <w:webHidden/>
-              </w:rPr>
+              <w:t>4</w:t>
               <w:fldChar w:fldCharType="end"/>
             </w:r>
           </w:hyperlink>
@@ -831,7 +647,7 @@
                 <w:rStyle w:val="Lienhypertexte"/>
                 <w:noProof/>
               </w:rPr>
-              <w:t>Lien vers la PR</w:t>
+              <w:t>PR d’intégration avec les réponses du copilote</w:t>
             </w:r>
             <w:r>
               <w:rPr>
@@ -839,46 +655,10 @@
                 <w:webHidden/>
               </w:rPr>
               <w:tab/>
-            </w:r>
-            <w:r>
-              <w:rPr>
-                <w:noProof/>
-                <w:webHidden/>
-              </w:rPr>
               <w:fldChar w:fldCharType="begin"/>
-            </w:r>
-            <w:r>
-              <w:rPr>
-                <w:noProof/>
-                <w:webHidden/>
-              </w:rPr>
               <w:instrText xml:space="preserve"> PAGEREF _Toc242870902 \h </w:instrText>
-            </w:r>
-            <w:r>
-              <w:rPr>
-                <w:noProof/>
-                <w:webHidden/>
-              </w:rPr>
-            </w:r>
-            <w:r>
-              <w:rPr>
-                <w:noProof/>
-                <w:webHidden/>
-              </w:rPr>
               <w:fldChar w:fldCharType="separate"/>
-            </w:r>
-            <w:r>
-              <w:rPr>
-                <w:noProof/>
-                <w:webHidden/>
-              </w:rPr>
-              <w:t>3</w:t>
-            </w:r>
-            <w:r>
-              <w:rPr>
-                <w:noProof/>
-                <w:webHidden/>
-              </w:rPr>
+              <w:t>4</w:t>
               <w:fldChar w:fldCharType="end"/>
             </w:r>
           </w:hyperlink>
@@ -909,17 +689,11 @@
       <w:bookmarkStart w:id="0" w:name="_Toc242870898"/>
       <w:r>
         <w:lastRenderedPageBreak/>
-        <w:t>T</w:t>
-      </w:r>
-      <w:r>
-        <w:t>able de décision</w:t>
+        <w:t>Table de décision</w:t>
       </w:r>
       <w:bookmarkEnd w:id="0"/>
       <w:r>
-        <w:t xml:space="preserve"> </w:t>
-      </w:r>
-      <w:r>
-        <w:t xml:space="preserve"> </w:t>
+        <w:t xml:space="preserve">  </w:t>
       </w:r>
     </w:p>
     <w:p/>
@@ -1077,10 +851,7 @@
           </w:tcPr>
           <w:p>
             <w:r>
-              <w:t>CA-06.</w:t>
-            </w:r>
-            <w:r>
-              <w:t>2</w:t>
+              <w:t>CA-06.2</w:t>
             </w:r>
           </w:p>
         </w:tc>
@@ -1122,13 +893,7 @@
           </w:tcPr>
           <w:p>
             <w:r>
-              <w:t>5,</w:t>
-            </w:r>
-            <w:r>
-              <w:t>5</w:t>
-            </w:r>
-            <w:r>
-              <w:t>,8</w:t>
+              <w:t>5,5,8</w:t>
             </w:r>
           </w:p>
         </w:tc>
@@ -1271,16 +1036,9 @@
             <w:tcW w:w="1874" w:type="dxa"/>
           </w:tcPr>
           <w:p>
-            <w:proofErr w:type="spellStart"/>
-            <w:proofErr w:type="gramStart"/>
-            <w:r>
-              <w:t>Café,Café</w:t>
-            </w:r>
-            <w:proofErr w:type="gramEnd"/>
-            <w:r>
-              <w:t>,Café</w:t>
-            </w:r>
-            <w:proofErr w:type="spellEnd"/>
+            <w:r>
+              <w:t>Café,Café,Café</w:t>
+            </w:r>
           </w:p>
         </w:tc>
         <w:tc>
@@ -1341,10 +1099,7 @@
           </w:tcPr>
           <w:p>
             <w:r>
-              <w:t>2</w:t>
-            </w:r>
-            <w:r>
-              <w:t xml:space="preserve"> </w:t>
+              <w:t xml:space="preserve">2 </w:t>
             </w:r>
           </w:p>
         </w:tc>
@@ -1354,16 +1109,7 @@
           </w:tcPr>
           <w:p>
             <w:r>
-              <w:t>3,</w:t>
-            </w:r>
-            <w:r>
-              <w:t>5</w:t>
-            </w:r>
-            <w:r>
-              <w:t>,</w:t>
-            </w:r>
-            <w:r>
-              <w:t>8</w:t>
+              <w:t>3,5,8</w:t>
             </w:r>
           </w:p>
         </w:tc>
@@ -1393,13 +1139,7 @@
           </w:tcPr>
           <w:p>
             <w:r>
-              <w:t>CA-0</w:t>
-            </w:r>
-            <w:r>
-              <w:t>7</w:t>
-            </w:r>
-            <w:r>
-              <w:t>.1</w:t>
+              <w:t>CA-07.1</w:t>
             </w:r>
           </w:p>
         </w:tc>
@@ -1440,13 +1180,8 @@
             <w:tcW w:w="1874" w:type="dxa"/>
           </w:tcPr>
           <w:p>
-            <w:proofErr w:type="gramStart"/>
-            <w:r>
-              <w:t>?,</w:t>
-            </w:r>
-            <w:proofErr w:type="gramEnd"/>
-            <w:r>
-              <w:t xml:space="preserve"> 5,8</w:t>
+            <w:r>
+              <w:t xml:space="preserve">?, 5,8</w:t>
             </w:r>
           </w:p>
         </w:tc>
@@ -1456,15 +1191,7 @@
           </w:tcPr>
           <w:p>
             <w:r>
-              <w:t xml:space="preserve">Revote </w:t>
-            </w:r>
-            <w:proofErr w:type="gramStart"/>
-            <w:r>
-              <w:t>( ?</w:t>
-            </w:r>
-            <w:proofErr w:type="gramEnd"/>
-            <w:r>
-              <w:t>)</w:t>
+              <w:t xml:space="preserve">Revote ( ?)</w:t>
             </w:r>
           </w:p>
         </w:tc>
@@ -1526,13 +1253,7 @@
           </w:tcPr>
           <w:p>
             <w:r>
-              <w:t>5</w:t>
-            </w:r>
-            <w:r>
-              <w:t>,5</w:t>
-            </w:r>
-            <w:r>
-              <w:t>,8,8</w:t>
+              <w:t>5,5,8,8</w:t>
             </w:r>
           </w:p>
         </w:tc>
@@ -1604,13 +1325,8 @@
           </w:tcPr>
           <w:p>
             <w:r>
-              <w:t>5,</w:t>
-            </w:r>
-            <w:proofErr w:type="gramStart"/>
-            <w:r>
-              <w:t>5,Café</w:t>
-            </w:r>
-            <w:proofErr w:type="gramEnd"/>
+              <w:t>5,5,Café</w:t>
+            </w:r>
           </w:p>
         </w:tc>
         <w:tc>
@@ -1639,10 +1355,7 @@
           </w:tcPr>
           <w:p>
             <w:r>
-              <w:t>CA-10.</w:t>
-            </w:r>
-            <w:r>
-              <w:t>2</w:t>
+              <w:t>CA-10.2</w:t>
             </w:r>
           </w:p>
         </w:tc>
@@ -1654,61 +1367,55 @@
         <w:pStyle w:val="Titre4"/>
       </w:pPr>
       <w:r>
-        <w:t xml:space="preserve">Précisions : </w:t>
+        <w:t xml:space="preserve">Décisions inventées : </w:t>
       </w:r>
     </w:p>
     <w:p>
       <w:r>
-        <w:t>#</w:t>
+        <w:rPr>
+          <w:b/>
+          <w:bCs/>
+        </w:rPr>
+        <w:t xml:space="preserve">D-01 (ligne 6) : </w:t>
       </w:r>
       <w:r>
-        <w:t>6 : Si au moins un vote « ? » est présent alors on revote quel que soit la règle choisie ou le tour en cours.</w:t>
-      </w:r>
-      <w:r>
-        <w:tab/>
-      </w:r>
-      <w:r>
-        <w:br/>
-      </w:r>
-      <w:r>
-        <w:t xml:space="preserve">#4 &amp; </w:t>
-      </w:r>
-      <w:r>
-        <w:t>8</w:t>
-      </w:r>
-      <w:r>
-        <w:t xml:space="preserve"> : S’il y a au moins un vote café de présent on revote à moins qu’il n’y </w:t>
-      </w:r>
-      <w:r>
-        <w:t>ait</w:t>
-      </w:r>
-      <w:r>
-        <w:t xml:space="preserve"> une unanimité de café quel que soit le tour en cours et la règle choisie.</w:t>
+        <w:t>si au moins un joueur vote « ? », on revote, quels que soient la règle choisie et le tour en cours.</w:t>
       </w:r>
     </w:p>
     <w:p>
       <w:r>
-        <w:t>#</w:t>
+        <w:rPr>
+          <w:b/>
+          <w:bCs/>
+        </w:rPr>
+        <w:t xml:space="preserve">D-02 (lignes 4 et 8) : </w:t>
       </w:r>
       <w:r>
-        <w:t>7</w:t>
+        <w:t>si au moins un joueur vote café sans que tous le fassent, on revote. Si tous les joueurs votent café, la partie est mise en pause et sauvegardée, quels que soient le tour et la règle.</w:t>
+      </w:r>
+    </w:p>
+    <w:p>
+      <w:r>
+        <w:rPr>
+          <w:b/>
+          <w:bCs/>
+        </w:rPr>
+        <w:t xml:space="preserve">D-03 (ligne 7) : </w:t>
       </w:r>
       <w:r>
-        <w:t> : S’il y a</w:t>
+        <w:t>avec la règle médiane et un nombre pair de votes, on ne fait pas la moyenne des deux valeurs centrales : on retient la plus grande, par précaution, pour ne pas sous-estimer une tâche.</w:t>
+      </w:r>
+    </w:p>
+    <w:p>
+      <w:r>
+        <w:rPr>
+          <w:b/>
+          <w:bCs/>
+        </w:rPr>
+        <w:t xml:space="preserve">D-04 : </w:t>
       </w:r>
       <w:r>
-        <w:t xml:space="preserve"> un nombre pair de vote avec une règle médiane au lieu de faire la moyenne des valeurs centrales. </w:t>
-      </w:r>
-      <w:proofErr w:type="spellStart"/>
-      <w:r>
-        <w:t>Ont</w:t>
-      </w:r>
-      <w:proofErr w:type="spellEnd"/>
-      <w:r>
-        <w:t xml:space="preserve"> prend la plus grande des valeurs centrales par principe de précaution pour ne pas risquer de sous évaluer une tache.</w:t>
-      </w:r>
-      <w:r>
-        <w:br/>
+        <w:t>si aucun vote n’est reçu, le moteur renvoie « revote » par sécurité.</w:t>
       </w:r>
     </w:p>
     <w:p>
@@ -1726,14 +1433,9 @@
       <w:bookmarkStart w:id="1" w:name="_Toc242870899"/>
       <w:r>
         <w:lastRenderedPageBreak/>
-        <w:t xml:space="preserve">Liste des </w:t>
-      </w:r>
-      <w:proofErr w:type="spellStart"/>
-      <w:r>
-        <w:t>commits</w:t>
+        <w:t xml:space="preserve">Liens</w:t>
       </w:r>
       <w:bookmarkEnd w:id="1"/>
-      <w:proofErr w:type="spellEnd"/>
     </w:p>
     <w:p>
       <w:pPr>
@@ -1741,7 +1443,7 @@
       </w:pPr>
       <w:bookmarkStart w:id="2" w:name="_Toc242870900"/>
       <w:r>
-        <w:t>Rouge</w:t>
+        <w:t>Commit rouge (tests seuls)</w:t>
       </w:r>
       <w:bookmarkEnd w:id="2"/>
     </w:p>
@@ -1756,12 +1458,27 @@
       </w:hyperlink>
     </w:p>
     <w:p>
+      <w:r>
+        <w:t xml:space="preserve">Run rouge de la CI correspondant (8 tests en échec) :</w:t>
+      </w:r>
+    </w:p>
+    <w:p>
+      <w:hyperlink r:id="rId19" w:history="1">
+        <w:r>
+          <w:rPr>
+            <w:rStyle w:val="Lienhypertexte"/>
+          </w:rPr>
+          <w:t>https://github.com/Corentin-Legrand/41LIDA01_B5_CAPI/actions/runs/38430596518/job/115411442393</w:t>
+        </w:r>
+      </w:hyperlink>
+    </w:p>
+    <w:p>
       <w:pPr>
         <w:pStyle w:val="Titre2"/>
       </w:pPr>
       <w:bookmarkStart w:id="3" w:name="_Toc242870901"/>
       <w:r>
-        <w:t>Vert</w:t>
+        <w:t>Run vert de la CI</w:t>
       </w:r>
       <w:bookmarkEnd w:id="3"/>
     </w:p>
@@ -1771,7 +1488,7 @@
           <w:rPr>
             <w:rStyle w:val="Lienhypertexte"/>
           </w:rPr>
-          <w:t>https://github.com/Corentin-Legrand/41LIDA01_B5_CAPI/commit/87b4c8a00e11dc7b66ec27b18844c8cbc219bbb3</w:t>
+          <w:t>https://github.com/Corentin-Legrand/41LIDA01_B5_CAPI/actions/runs/38543226715/job/115782840590</w:t>
         </w:r>
       </w:hyperlink>
     </w:p>
@@ -1781,7 +1498,7 @@
       </w:pPr>
       <w:bookmarkStart w:id="4" w:name="_Toc242870902"/>
       <w:r>
-        <w:t>Lien vers la PR</w:t>
+        <w:t>PR d’intégration avec les réponses du copilote</w:t>
       </w:r>
       <w:bookmarkEnd w:id="4"/>
     </w:p>
@@ -1795,6 +1512,11 @@
         </w:r>
       </w:hyperlink>
     </w:p>
+    <w:p>
+      <w:r>
+        <w:t>Cette PR contient la revue du copilote (Valentin Perroux), avec ses réponses et son approbation avant la fusion dans main.</w:t>
+      </w:r>
+    </w:p>
     <w:p/>
     <w:sectPr>
       <w:headerReference w:type="default" r:id="rId12"/>
@@ -1803,7 +1525,7 @@
       <w:footerReference w:type="first" r:id="rId15"/>
       <w:pgSz w:w="11906" w:h="16838"/>
       <w:pgMar w:top="1417" w:right="1417" w:bottom="1417" w:left="1417" w:header="708" w:footer="708" w:gutter="0"/>
-      <w:pgNumType w:start="0"/>
+      <w:pgNumType w:start="1"/>
       <w:cols w:space="708"/>
       <w:titlePg/>
       <w:docGrid w:linePitch="360"/>
@@ -2101,7 +1823,7 @@
                 <w:b/>
                 <w:bCs/>
               </w:rPr>
-              <w:t>12</w:t>
+              <w:t>14</w:t>
             </w:r>
             <w:r>
               <w:rPr>

</xml_diff>